<commit_message>
fix(commit-push-all): honour --scope in any argument position, refuse ambiguous argv, and commit the message verbatim
The argument parser stopped at the first non-flag token, so a --scope
placed after the message was silently discarded and the run fell through
to the unscoped git add -A sweep. Flags are now parsed in any position,
exactly one message is required, and a --scope token after -- is refused
so it can never degrade into an unscoped commit.

The message is written to a file in the git dir and committed with
git commit --cleanup=verbatim -F, so it lands byte-for-byte. A new
--message-file option (path or - for stdin) lets callers avoid shell
quoting; the earlier loss of an inline-code span was caused by the
calling shell expanding a double-quoted backtick pair, reproduced and
documented in the guide.

Test: tests/unit/test_commit_push_all_args.sh, 9 of 13 fail on the
pre-fix script, 13 of 13 pass after; two paired mutations fail 3 and 4. [skip-ci]
</commit_message>
<xml_diff>
--- a/docs/scripts/commit-push-all.docx
+++ b/docs/scripts/commit-push-all.docx
@@ -2,7 +2,7 @@
 <file path=word/document.xml><?xml version="1.0" encoding="utf-8"?>
 <w:document xmlns:w="http://schemas.openxmlformats.org/wordprocessingml/2006/main" xmlns:m="http://schemas.openxmlformats.org/officeDocument/2006/math" xmlns:r="http://schemas.openxmlformats.org/officeDocument/2006/relationships" xmlns:o="urn:schemas-microsoft-com:office:office" xmlns:v="urn:schemas-microsoft-com:vml" xmlns:w10="urn:schemas-microsoft-com:office:word" xmlns:a="http://schemas.openxmlformats.org/drawingml/2006/main" xmlns:pic="http://schemas.openxmlformats.org/drawingml/2006/picture" xmlns:wp="http://schemas.openxmlformats.org/drawingml/2006/wordprocessingDrawing">
   <w:body>
-    <w:bookmarkStart w:id="23" w:name="Xbaa4d788afa9dc882e342f9c286ba4fd650e62a"/>
+    <w:bookmarkStart w:id="24" w:name="Xbaa4d788afa9dc882e342f9c286ba4fd650e62a"/>
     <w:p>
       <w:pPr>
         <w:pStyle w:val="Heading1"/>
@@ -26,7 +26,7 @@
         <w:t xml:space="preserve"> </w:t>
       </w:r>
       <w:r>
-        <w:t xml:space="preserve">1</w:t>
+        <w:t xml:space="preserve">2</w:t>
       </w:r>
       <w:r>
         <w:t xml:space="preserve"> </w:t>
@@ -42,7 +42,7 @@
         <w:t xml:space="preserve"> </w:t>
       </w:r>
       <w:r>
-        <w:t xml:space="preserve">2026-08-18T18:49:45Z</w:t>
+        <w:t xml:space="preserve">2026-09-26T16:28:00Z</w:t>
       </w:r>
       <w:r>
         <w:t xml:space="preserve"> </w:t>
@@ -74,7 +74,7 @@
         <w:t xml:space="preserve"> </w:t>
       </w:r>
       <w:r>
-        <w:t xml:space="preserve">task #66 (BOB-068 sweep-pattern interim remedy)</w:t>
+        <w:t xml:space="preserve">task #66 (BOB-068 sweep-pattern interim remedy); BOB-246 (argument order + message fidelity)</w:t>
       </w:r>
     </w:p>
     <w:bookmarkStart w:id="9" w:name="overview"/>
@@ -700,7 +700,7 @@
       </w:r>
     </w:p>
     <w:bookmarkEnd w:id="11"/>
-    <w:bookmarkStart w:id="14" w:name="usage-examples"/>
+    <w:bookmarkStart w:id="15" w:name="usage-examples"/>
     <w:p>
       <w:pPr>
         <w:pStyle w:val="Heading2"/>
@@ -1028,14 +1028,13 @@
       </w:r>
     </w:p>
     <w:bookmarkEnd w:id="13"/>
-    <w:bookmarkEnd w:id="14"/>
-    <w:bookmarkStart w:id="15" w:name="safety-layer-the-reviewers-exact-concern"/>
-    <w:p>
-      <w:pPr>
-        <w:pStyle w:val="Heading2"/>
-      </w:pPr>
-      <w:r>
-        <w:t xml:space="preserve">Safety layer (the reviewer’s exact concern)</w:t>
+    <w:bookmarkStart w:id="14" w:name="argument-order-and-the-message-bob-246"/>
+    <w:p>
+      <w:pPr>
+        <w:pStyle w:val="Heading3"/>
+      </w:pPr>
+      <w:r>
+        <w:t xml:space="preserve">Argument order and the message (BOB-246)</w:t>
       </w:r>
     </w:p>
     <w:p>
@@ -1043,7 +1042,357 @@
         <w:pStyle w:val="FirstParagraph"/>
       </w:pPr>
       <w:r>
-        <w:t xml:space="preserve">Scoped mode does, in order:</w:t>
+        <w:t xml:space="preserve">Flags may appear</w:t>
+      </w:r>
+      <w:r>
+        <w:t xml:space="preserve"> </w:t>
+      </w:r>
+      <w:r>
+        <w:rPr>
+          <w:b/>
+          <w:bCs/>
+        </w:rPr>
+        <w:t xml:space="preserve">before or after</w:t>
+      </w:r>
+      <w:r>
+        <w:t xml:space="preserve"> </w:t>
+      </w:r>
+      <w:r>
+        <w:t xml:space="preserve">the message:</w:t>
+      </w:r>
+    </w:p>
+    <w:p>
+      <w:pPr>
+        <w:pStyle w:val="SourceCode"/>
+      </w:pPr>
+      <w:r>
+        <w:rPr>
+          <w:rStyle w:val="FunctionTok"/>
+        </w:rPr>
+        <w:t xml:space="preserve">bash</w:t>
+      </w:r>
+      <w:r>
+        <w:rPr>
+          <w:rStyle w:val="NormalTok"/>
+        </w:rPr>
+        <w:t xml:space="preserve"> scripts/commit-push-all.sh </w:t>
+      </w:r>
+      <w:r>
+        <w:rPr>
+          <w:rStyle w:val="AttributeTok"/>
+        </w:rPr>
+        <w:t xml:space="preserve">--scope</w:t>
+      </w:r>
+      <w:r>
+        <w:rPr>
+          <w:rStyle w:val="NormalTok"/>
+        </w:rPr>
+        <w:t xml:space="preserve"> a.sh </w:t>
+      </w:r>
+      <w:r>
+        <w:rPr>
+          <w:rStyle w:val="StringTok"/>
+        </w:rPr>
+        <w:t xml:space="preserve">"fix: a"</w:t>
+      </w:r>
+      <w:r>
+        <w:rPr>
+          <w:rStyle w:val="NormalTok"/>
+        </w:rPr>
+        <w:t xml:space="preserve">            </w:t>
+      </w:r>
+      <w:r>
+        <w:rPr>
+          <w:rStyle w:val="CommentTok"/>
+        </w:rPr>
+        <w:t xml:space="preserve"># flags first</w:t>
+      </w:r>
+      <w:r>
+        <w:br/>
+      </w:r>
+      <w:r>
+        <w:rPr>
+          <w:rStyle w:val="FunctionTok"/>
+        </w:rPr>
+        <w:t xml:space="preserve">bash</w:t>
+      </w:r>
+      <w:r>
+        <w:rPr>
+          <w:rStyle w:val="NormalTok"/>
+        </w:rPr>
+        <w:t xml:space="preserve"> scripts/commit-push-all.sh </w:t>
+      </w:r>
+      <w:r>
+        <w:rPr>
+          <w:rStyle w:val="StringTok"/>
+        </w:rPr>
+        <w:t xml:space="preserve">"fix: a"</w:t>
+      </w:r>
+      <w:r>
+        <w:rPr>
+          <w:rStyle w:val="NormalTok"/>
+        </w:rPr>
+        <w:t xml:space="preserve"> </w:t>
+      </w:r>
+      <w:r>
+        <w:rPr>
+          <w:rStyle w:val="AttributeTok"/>
+        </w:rPr>
+        <w:t xml:space="preserve">--scope</w:t>
+      </w:r>
+      <w:r>
+        <w:rPr>
+          <w:rStyle w:val="NormalTok"/>
+        </w:rPr>
+        <w:t xml:space="preserve"> a.sh            </w:t>
+      </w:r>
+      <w:r>
+        <w:rPr>
+          <w:rStyle w:val="CommentTok"/>
+        </w:rPr>
+        <w:t xml:space="preserve"># flags last</w:t>
+      </w:r>
+      <w:r>
+        <w:br/>
+      </w:r>
+      <w:r>
+        <w:rPr>
+          <w:rStyle w:val="FunctionTok"/>
+        </w:rPr>
+        <w:t xml:space="preserve">bash</w:t>
+      </w:r>
+      <w:r>
+        <w:rPr>
+          <w:rStyle w:val="NormalTok"/>
+        </w:rPr>
+        <w:t xml:space="preserve"> scripts/commit-push-all.sh </w:t>
+      </w:r>
+      <w:r>
+        <w:rPr>
+          <w:rStyle w:val="AttributeTok"/>
+        </w:rPr>
+        <w:t xml:space="preserve">--scope</w:t>
+      </w:r>
+      <w:r>
+        <w:rPr>
+          <w:rStyle w:val="NormalTok"/>
+        </w:rPr>
+        <w:t xml:space="preserve"> a.sh </w:t>
+      </w:r>
+      <w:r>
+        <w:rPr>
+          <w:rStyle w:val="StringTok"/>
+        </w:rPr>
+        <w:t xml:space="preserve">"fix: a"</w:t>
+      </w:r>
+      <w:r>
+        <w:rPr>
+          <w:rStyle w:val="NormalTok"/>
+        </w:rPr>
+        <w:t xml:space="preserve"> </w:t>
+      </w:r>
+      <w:r>
+        <w:rPr>
+          <w:rStyle w:val="AttributeTok"/>
+        </w:rPr>
+        <w:t xml:space="preserve">--scope</w:t>
+      </w:r>
+      <w:r>
+        <w:rPr>
+          <w:rStyle w:val="NormalTok"/>
+        </w:rPr>
+        <w:t xml:space="preserve"> b.sh</w:t>
+      </w:r>
+      <w:r>
+        <w:br/>
+      </w:r>
+      <w:r>
+        <w:rPr>
+          <w:rStyle w:val="FunctionTok"/>
+        </w:rPr>
+        <w:t xml:space="preserve">bash</w:t>
+      </w:r>
+      <w:r>
+        <w:rPr>
+          <w:rStyle w:val="NormalTok"/>
+        </w:rPr>
+        <w:t xml:space="preserve"> scripts/commit-push-all.sh </w:t>
+      </w:r>
+      <w:r>
+        <w:rPr>
+          <w:rStyle w:val="AttributeTok"/>
+        </w:rPr>
+        <w:t xml:space="preserve">--scope</w:t>
+      </w:r>
+      <w:r>
+        <w:rPr>
+          <w:rStyle w:val="NormalTok"/>
+        </w:rPr>
+        <w:t xml:space="preserve"> a.sh </w:t>
+      </w:r>
+      <w:r>
+        <w:rPr>
+          <w:rStyle w:val="AttributeTok"/>
+        </w:rPr>
+        <w:t xml:space="preserve">--message-file</w:t>
+      </w:r>
+      <w:r>
+        <w:rPr>
+          <w:rStyle w:val="NormalTok"/>
+        </w:rPr>
+        <w:t xml:space="preserve"> msg.txt</w:t>
+      </w:r>
+      <w:r>
+        <w:br/>
+      </w:r>
+      <w:r>
+        <w:rPr>
+          <w:rStyle w:val="BuiltInTok"/>
+        </w:rPr>
+        <w:t xml:space="preserve">printf</w:t>
+      </w:r>
+      <w:r>
+        <w:rPr>
+          <w:rStyle w:val="NormalTok"/>
+        </w:rPr>
+        <w:t xml:space="preserve"> </w:t>
+      </w:r>
+      <w:r>
+        <w:rPr>
+          <w:rStyle w:val="StringTok"/>
+        </w:rPr>
+        <w:t xml:space="preserve">'%s'</w:t>
+      </w:r>
+      <w:r>
+        <w:rPr>
+          <w:rStyle w:val="NormalTok"/>
+        </w:rPr>
+        <w:t xml:space="preserve"> </w:t>
+      </w:r>
+      <w:r>
+        <w:rPr>
+          <w:rStyle w:val="StringTok"/>
+        </w:rPr>
+        <w:t xml:space="preserve">"</w:t>
+      </w:r>
+      <w:r>
+        <w:rPr>
+          <w:rStyle w:val="VariableTok"/>
+        </w:rPr>
+        <w:t xml:space="preserve">$text</w:t>
+      </w:r>
+      <w:r>
+        <w:rPr>
+          <w:rStyle w:val="StringTok"/>
+        </w:rPr>
+        <w:t xml:space="preserve">"</w:t>
+      </w:r>
+      <w:r>
+        <w:rPr>
+          <w:rStyle w:val="NormalTok"/>
+        </w:rPr>
+        <w:t xml:space="preserve"> </w:t>
+      </w:r>
+      <w:r>
+        <w:rPr>
+          <w:rStyle w:val="KeywordTok"/>
+        </w:rPr>
+        <w:t xml:space="preserve">|</w:t>
+      </w:r>
+      <w:r>
+        <w:rPr>
+          <w:rStyle w:val="NormalTok"/>
+        </w:rPr>
+        <w:t xml:space="preserve"> </w:t>
+      </w:r>
+      <w:r>
+        <w:rPr>
+          <w:rStyle w:val="FunctionTok"/>
+        </w:rPr>
+        <w:t xml:space="preserve">bash</w:t>
+      </w:r>
+      <w:r>
+        <w:rPr>
+          <w:rStyle w:val="NormalTok"/>
+        </w:rPr>
+        <w:t xml:space="preserve"> scripts/commit-push-all.sh </w:t>
+      </w:r>
+      <w:r>
+        <w:rPr>
+          <w:rStyle w:val="AttributeTok"/>
+        </w:rPr>
+        <w:t xml:space="preserve">--scope</w:t>
+      </w:r>
+      <w:r>
+        <w:rPr>
+          <w:rStyle w:val="NormalTok"/>
+        </w:rPr>
+        <w:t xml:space="preserve"> a.sh </w:t>
+      </w:r>
+      <w:r>
+        <w:rPr>
+          <w:rStyle w:val="AttributeTok"/>
+        </w:rPr>
+        <w:t xml:space="preserve">--message-file</w:t>
+      </w:r>
+      <w:r>
+        <w:rPr>
+          <w:rStyle w:val="NormalTok"/>
+        </w:rPr>
+        <w:t xml:space="preserve"> </w:t>
+      </w:r>
+      <w:r>
+        <w:rPr>
+          <w:rStyle w:val="AttributeTok"/>
+        </w:rPr>
+        <w:t xml:space="preserve">-</w:t>
+      </w:r>
+    </w:p>
+    <w:p>
+      <w:pPr>
+        <w:pStyle w:val="FirstParagraph"/>
+      </w:pPr>
+      <w:r>
+        <w:t xml:space="preserve">Until BOB-246 the parser stopped at the first non-flag token: a</w:t>
+      </w:r>
+      <w:r>
+        <w:t xml:space="preserve"> </w:t>
+      </w:r>
+      <w:r>
+        <w:rPr>
+          <w:rStyle w:val="VerbatimChar"/>
+        </w:rPr>
+        <w:t xml:space="preserve">--scope</w:t>
+      </w:r>
+      <w:r>
+        <w:t xml:space="preserve"> </w:t>
+      </w:r>
+      <w:r>
+        <w:t xml:space="preserve">placed after the message was silently discarded and the run</w:t>
+      </w:r>
+      <w:r>
+        <w:t xml:space="preserve"> </w:t>
+      </w:r>
+      <w:r>
+        <w:t xml:space="preserve">fell through to the unscoped</w:t>
+      </w:r>
+      <w:r>
+        <w:t xml:space="preserve"> </w:t>
+      </w:r>
+      <w:r>
+        <w:rPr>
+          <w:rStyle w:val="VerbatimChar"/>
+        </w:rPr>
+        <w:t xml:space="preserve">git add -A</w:t>
+      </w:r>
+      <w:r>
+        <w:t xml:space="preserve">, sweeping unrelated files into</w:t>
+      </w:r>
+      <w:r>
+        <w:t xml:space="preserve"> </w:t>
+      </w:r>
+      <w:r>
+        <w:t xml:space="preserve">the commit and pushing them. Now:</w:t>
       </w:r>
     </w:p>
     <w:p>
@@ -1055,50 +1404,31 @@
         </w:numPr>
       </w:pPr>
       <w:r>
-        <w:rPr>
-          <w:rStyle w:val="VerbatimChar"/>
-        </w:rPr>
-        <w:t xml:space="preserve">git add -- &lt;scope-path-1&gt; &lt;scope-path-2&gt; ...</w:t>
-      </w:r>
-      <w:r>
-        <w:t xml:space="preserve"> </w:t>
-      </w:r>
-      <w:r>
-        <w:t xml:space="preserve">— stage</w:t>
-      </w:r>
-      <w:r>
-        <w:t xml:space="preserve"> </w:t>
-      </w:r>
-      <w:r>
-        <w:rPr>
-          <w:i/>
-          <w:iCs/>
-        </w:rPr>
-        <w:t xml:space="preserve">only</w:t>
-      </w:r>
-      <w:r>
-        <w:t xml:space="preserve"> </w:t>
-      </w:r>
-      <w:r>
-        <w:t xml:space="preserve">the</w:t>
-      </w:r>
-      <w:r>
-        <w:t xml:space="preserve"> </w:t>
-      </w:r>
-      <w:r>
-        <w:t xml:space="preserve">declared paths. Never</w:t>
-      </w:r>
-      <w:r>
-        <w:t xml:space="preserve"> </w:t>
-      </w:r>
-      <w:r>
-        <w:rPr>
-          <w:rStyle w:val="VerbatimChar"/>
-        </w:rPr>
-        <w:t xml:space="preserve">git add -A</w:t>
-      </w:r>
-      <w:r>
-        <w:t xml:space="preserve">.</w:t>
+        <w:t xml:space="preserve">every</w:t>
+      </w:r>
+      <w:r>
+        <w:t xml:space="preserve"> </w:t>
+      </w:r>
+      <w:r>
+        <w:rPr>
+          <w:rStyle w:val="VerbatimChar"/>
+        </w:rPr>
+        <w:t xml:space="preserve">--scope</w:t>
+      </w:r>
+      <w:r>
+        <w:t xml:space="preserve">/</w:t>
+      </w:r>
+      <w:r>
+        <w:rPr>
+          <w:rStyle w:val="VerbatimChar"/>
+        </w:rPr>
+        <w:t xml:space="preserve">--scope=</w:t>
+      </w:r>
+      <w:r>
+        <w:t xml:space="preserve"> </w:t>
+      </w:r>
+      <w:r>
+        <w:t xml:space="preserve">token is honoured wherever it appears;</w:t>
       </w:r>
     </w:p>
     <w:p>
@@ -1110,16 +1440,29 @@
         </w:numPr>
       </w:pPr>
       <w:r>
-        <w:t xml:space="preserve">Read the resulting staged set (</w:t>
-      </w:r>
-      <w:r>
-        <w:rPr>
-          <w:rStyle w:val="VerbatimChar"/>
-        </w:rPr>
-        <w:t xml:space="preserve">git diff --cached --name-only</w:t>
-      </w:r>
-      <w:r>
-        <w:t xml:space="preserve">).</w:t>
+        <w:t xml:space="preserve">exactly</w:t>
+      </w:r>
+      <w:r>
+        <w:t xml:space="preserve"> </w:t>
+      </w:r>
+      <w:r>
+        <w:rPr>
+          <w:b/>
+          <w:bCs/>
+        </w:rPr>
+        <w:t xml:space="preserve">one</w:t>
+      </w:r>
+      <w:r>
+        <w:t xml:space="preserve"> </w:t>
+      </w:r>
+      <w:r>
+        <w:t xml:space="preserve">message is required — a second positional argument is</w:t>
+      </w:r>
+      <w:r>
+        <w:t xml:space="preserve"> </w:t>
+      </w:r>
+      <w:r>
+        <w:t xml:space="preserve">refused (exit 2, the offending token printed, nothing committed);</w:t>
       </w:r>
     </w:p>
     <w:p>
@@ -1131,57 +1474,70 @@
         </w:numPr>
       </w:pPr>
       <w:r>
-        <w:t xml:space="preserve">For every staged path, confirm it</w:t>
-      </w:r>
-      <w:r>
-        <w:t xml:space="preserve"> </w:t>
-      </w:r>
-      <w:r>
-        <w:rPr>
-          <w:b/>
-          <w:bCs/>
-        </w:rPr>
-        <w:t xml:space="preserve">equals</w:t>
-      </w:r>
-      <w:r>
-        <w:t xml:space="preserve"> </w:t>
-      </w:r>
-      <w:r>
-        <w:t xml:space="preserve">a declared scope entry</w:t>
-      </w:r>
-      <w:r>
-        <w:t xml:space="preserve"> </w:t>
-      </w:r>
-      <w:r>
-        <w:t xml:space="preserve">or sits</w:t>
-      </w:r>
-      <w:r>
-        <w:t xml:space="preserve"> </w:t>
-      </w:r>
-      <w:r>
-        <w:rPr>
-          <w:b/>
-          <w:bCs/>
-        </w:rPr>
-        <w:t xml:space="preserve">under</w:t>
-      </w:r>
-      <w:r>
-        <w:t xml:space="preserve"> </w:t>
-      </w:r>
-      <w:r>
-        <w:t xml:space="preserve">one (a declared scope entry may be a directory</w:t>
-      </w:r>
-      <w:r>
-        <w:t xml:space="preserve"> </w:t>
-      </w:r>
-      <w:r>
-        <w:t xml:space="preserve">prefix). This is a structural match, never a substring match</w:t>
-      </w:r>
-      <w:r>
-        <w:t xml:space="preserve"> </w:t>
-      </w:r>
-      <w:r>
-        <w:t xml:space="preserve">(§11.4.201(7)(a)).</w:t>
+        <w:rPr>
+          <w:rStyle w:val="VerbatimChar"/>
+        </w:rPr>
+        <w:t xml:space="preserve">--</w:t>
+      </w:r>
+      <w:r>
+        <w:t xml:space="preserve"> </w:t>
+      </w:r>
+      <w:r>
+        <w:t xml:space="preserve">ends flag parsing; a</w:t>
+      </w:r>
+      <w:r>
+        <w:t xml:space="preserve"> </w:t>
+      </w:r>
+      <w:r>
+        <w:rPr>
+          <w:rStyle w:val="VerbatimChar"/>
+        </w:rPr>
+        <w:t xml:space="preserve">--scope</w:t>
+      </w:r>
+      <w:r>
+        <w:t xml:space="preserve">-shaped token after</w:t>
+      </w:r>
+      <w:r>
+        <w:t xml:space="preserve"> </w:t>
+      </w:r>
+      <w:r>
+        <w:rPr>
+          <w:rStyle w:val="VerbatimChar"/>
+        </w:rPr>
+        <w:t xml:space="preserve">--</w:t>
+      </w:r>
+      <w:r>
+        <w:t xml:space="preserve"> </w:t>
+      </w:r>
+      <w:r>
+        <w:t xml:space="preserve">is refused</w:t>
+      </w:r>
+      <w:r>
+        <w:t xml:space="preserve"> </w:t>
+      </w:r>
+      <w:r>
+        <w:t xml:space="preserve">rather than being taken as the message, so a</w:t>
+      </w:r>
+      <w:r>
+        <w:t xml:space="preserve"> </w:t>
+      </w:r>
+      <w:r>
+        <w:rPr>
+          <w:rStyle w:val="VerbatimChar"/>
+        </w:rPr>
+        <w:t xml:space="preserve">--scope</w:t>
+      </w:r>
+      <w:r>
+        <w:t xml:space="preserve"> </w:t>
+      </w:r>
+      <w:r>
+        <w:t xml:space="preserve">anywhere in</w:t>
+      </w:r>
+      <w:r>
+        <w:t xml:space="preserve"> </w:t>
+      </w:r>
+      <w:r>
+        <w:t xml:space="preserve">argv can never turn into an unscoped commit;</w:t>
       </w:r>
     </w:p>
     <w:p>
@@ -1193,77 +1549,260 @@
         </w:numPr>
       </w:pPr>
       <w:r>
-        <w:t xml:space="preserve">If anything staged falls outside the declared scope — e.g. a</w:t>
-      </w:r>
-      <w:r>
-        <w:t xml:space="preserve"> </w:t>
-      </w:r>
-      <w:r>
-        <w:t xml:space="preserve">concurrent subagent’s own</w:t>
-      </w:r>
-      <w:r>
-        <w:t xml:space="preserve"> </w:t>
-      </w:r>
-      <w:r>
-        <w:rPr>
-          <w:rStyle w:val="VerbatimChar"/>
-        </w:rPr>
-        <w:t xml:space="preserve">git add</w:t>
-      </w:r>
-      <w:r>
-        <w:t xml:space="preserve">, or residue from an earlier</w:t>
-      </w:r>
-      <w:r>
-        <w:t xml:space="preserve"> </w:t>
-      </w:r>
-      <w:r>
-        <w:t xml:space="preserve">unscoped</w:t>
-      </w:r>
-      <w:r>
-        <w:t xml:space="preserve"> </w:t>
-      </w:r>
-      <w:r>
-        <w:rPr>
-          <w:rStyle w:val="VerbatimChar"/>
-        </w:rPr>
-        <w:t xml:space="preserve">git add -A</w:t>
-      </w:r>
-      <w:r>
-        <w:t xml:space="preserve"> </w:t>
-      </w:r>
-      <w:r>
-        <w:t xml:space="preserve">that never got committed — the commit is</w:t>
-      </w:r>
-      <w:r>
-        <w:t xml:space="preserve"> </w:t>
-      </w:r>
+        <w:t xml:space="preserve">supplying the message twice (</w:t>
+      </w:r>
+      <w:r>
+        <w:rPr>
+          <w:rStyle w:val="VerbatimChar"/>
+        </w:rPr>
+        <w:t xml:space="preserve">--message-file</w:t>
+      </w:r>
+      <w:r>
+        <w:t xml:space="preserve"> </w:t>
+      </w:r>
+      <w:r>
+        <w:t xml:space="preserve">plus a positional) is</w:t>
+      </w:r>
+      <w:r>
+        <w:t xml:space="preserve"> </w:t>
+      </w:r>
+      <w:r>
+        <w:t xml:space="preserve">refused.</w:t>
+      </w:r>
+    </w:p>
+    <w:p>
+      <w:pPr>
+        <w:pStyle w:val="FirstParagraph"/>
+      </w:pPr>
+      <w:r>
+        <w:t xml:space="preserve">The message is written to a file inside the git directory and committed</w:t>
+      </w:r>
+      <w:r>
+        <w:t xml:space="preserve"> </w:t>
+      </w:r>
+      <w:r>
+        <w:t xml:space="preserve">with</w:t>
+      </w:r>
+      <w:r>
+        <w:t xml:space="preserve"> </w:t>
+      </w:r>
+      <w:r>
+        <w:rPr>
+          <w:rStyle w:val="VerbatimChar"/>
+        </w:rPr>
+        <w:t xml:space="preserve">git commit --cleanup=verbatim -F</w:t>
+      </w:r>
+      <w:r>
+        <w:t xml:space="preserve">, so it lands byte-for-byte:</w:t>
+      </w:r>
+      <w:r>
+        <w:t xml:space="preserve"> </w:t>
+      </w:r>
+      <w:r>
+        <w:t xml:space="preserve">backticks,</w:t>
+      </w:r>
+      <w:r>
+        <w:t xml:space="preserve"> </w:t>
+      </w:r>
+      <w:r>
+        <w:rPr>
+          <w:rStyle w:val="VerbatimChar"/>
+        </w:rPr>
+        <w:t xml:space="preserve">$(...)</w:t>
+      </w:r>
+      <w:r>
+        <w:t xml:space="preserve">, both quote kinds, blank lines,</w:t>
+      </w:r>
+      <w:r>
+        <w:t xml:space="preserve"> </w:t>
+      </w:r>
+      <w:r>
+        <w:rPr>
+          <w:rStyle w:val="VerbatimChar"/>
+        </w:rPr>
+        <w:t xml:space="preserve">#</w:t>
+      </w:r>
+      <w:r>
+        <w:t xml:space="preserve">-led lines and</w:t>
+      </w:r>
+      <w:r>
+        <w:t xml:space="preserve"> </w:t>
+      </w:r>
+      <w:r>
+        <w:t xml:space="preserve">trailing whitespace are all kept. When the long gate is skipped the</w:t>
+      </w:r>
+      <w:r>
+        <w:t xml:space="preserve"> </w:t>
+      </w:r>
+      <w:r>
+        <w:t xml:space="preserve">literal</w:t>
+      </w:r>
+      <w:r>
+        <w:t xml:space="preserve"> </w:t>
+      </w:r>
+      <w:r>
+        <w:rPr>
+          <w:rStyle w:val="VerbatimChar"/>
+        </w:rPr>
+        <w:t xml:space="preserve">[skip-ci]</w:t>
+      </w:r>
+      <w:r>
+        <w:t xml:space="preserve"> </w:t>
+      </w:r>
+      <w:r>
+        <w:t xml:space="preserve">is appended to the end of the message, as before.</w:t>
+      </w:r>
+    </w:p>
+    <w:p>
+      <w:pPr>
+        <w:pStyle w:val="BodyText"/>
+      </w:pPr>
       <w:r>
         <w:rPr>
           <w:b/>
           <w:bCs/>
         </w:rPr>
-        <w:t xml:space="preserve">REJECTED</w:t>
-      </w:r>
-      <w:r>
-        <w:t xml:space="preserve"> </w:t>
-      </w:r>
-      <w:r>
-        <w:t xml:space="preserve">(exit 1) with every unexpected path printed, plus a</w:t>
-      </w:r>
-      <w:r>
-        <w:t xml:space="preserve"> </w:t>
-      </w:r>
-      <w:r>
-        <w:t xml:space="preserve">remediation pointer (</w:t>
-      </w:r>
-      <w:r>
-        <w:rPr>
-          <w:rStyle w:val="VerbatimChar"/>
-        </w:rPr>
-        <w:t xml:space="preserve">git restore --staged &lt;file&gt;</w:t>
-      </w:r>
-      <w:r>
-        <w:t xml:space="preserve">).</w:t>
+        <w:t xml:space="preserve">Backticks and the caller’s shell.</w:t>
+      </w:r>
+      <w:r>
+        <w:t xml:space="preserve"> </w:t>
+      </w:r>
+      <w:r>
+        <w:t xml:space="preserve">Backticks or</w:t>
+      </w:r>
+      <w:r>
+        <w:t xml:space="preserve"> </w:t>
+      </w:r>
+      <w:r>
+        <w:rPr>
+          <w:rStyle w:val="VerbatimChar"/>
+        </w:rPr>
+        <w:t xml:space="preserve">$(...)</w:t>
+      </w:r>
+      <w:r>
+        <w:t xml:space="preserve"> </w:t>
+      </w:r>
+      <w:r>
+        <w:t xml:space="preserve">inside a</w:t>
+      </w:r>
+      <w:r>
+        <w:t xml:space="preserve"> </w:t>
+      </w:r>
+      <w:r>
+        <w:rPr>
+          <w:i/>
+          <w:iCs/>
+        </w:rPr>
+        <w:t xml:space="preserve">double-quoted</w:t>
+      </w:r>
+      <w:r>
+        <w:t xml:space="preserve"> </w:t>
+      </w:r>
+      <w:r>
+        <w:t xml:space="preserve">message are expanded by the calling shell before this</w:t>
+      </w:r>
+      <w:r>
+        <w:t xml:space="preserve"> </w:t>
+      </w:r>
+      <w:r>
+        <w:t xml:space="preserve">script receives its arguments;</w:t>
+      </w:r>
+      <w:r>
+        <w:t xml:space="preserve"> </w:t>
+      </w:r>
+      <w:r>
+        <w:rPr>
+          <w:rStyle w:val="VerbatimChar"/>
+        </w:rPr>
+        <w:t xml:space="preserve">"the same `|| true` guard"</w:t>
+      </w:r>
+      <w:r>
+        <w:t xml:space="preserve"> </w:t>
+      </w:r>
+      <w:r>
+        <w:t xml:space="preserve">reaches</w:t>
+      </w:r>
+      <w:r>
+        <w:t xml:space="preserve"> </w:t>
+      </w:r>
+      <w:r>
+        <w:t xml:space="preserve">the script as</w:t>
+      </w:r>
+      <w:r>
+        <w:t xml:space="preserve"> </w:t>
+      </w:r>
+      <w:r>
+        <w:rPr>
+          <w:rStyle w:val="VerbatimChar"/>
+        </w:rPr>
+        <w:t xml:space="preserve">the same  guard</w:t>
+      </w:r>
+      <w:r>
+        <w:t xml:space="preserve">, with a command-substitution syntax</w:t>
+      </w:r>
+      <w:r>
+        <w:t xml:space="preserve"> </w:t>
+      </w:r>
+      <w:r>
+        <w:t xml:space="preserve">error printed by the caller’s shell. That is how commit</w:t>
+      </w:r>
+      <w:r>
+        <w:t xml:space="preserve"> </w:t>
+      </w:r>
+      <w:r>
+        <w:rPr>
+          <w:rStyle w:val="VerbatimChar"/>
+        </w:rPr>
+        <w:t xml:space="preserve">c67bcec</w:t>
+      </w:r>
+      <w:r>
+        <w:t xml:space="preserve"> </w:t>
+      </w:r>
+      <w:r>
+        <w:t xml:space="preserve">lost</w:t>
+      </w:r>
+      <w:r>
+        <w:t xml:space="preserve"> </w:t>
+      </w:r>
+      <w:r>
+        <w:t xml:space="preserve">an inline-code span — the wrapper never saw the backticks. Single-quote</w:t>
+      </w:r>
+      <w:r>
+        <w:t xml:space="preserve"> </w:t>
+      </w:r>
+      <w:r>
+        <w:t xml:space="preserve">such messages, or write them to a file and use</w:t>
+      </w:r>
+      <w:r>
+        <w:t xml:space="preserve"> </w:t>
+      </w:r>
+      <w:r>
+        <w:rPr>
+          <w:rStyle w:val="VerbatimChar"/>
+        </w:rPr>
+        <w:t xml:space="preserve">--message-file</w:t>
+      </w:r>
+      <w:r>
+        <w:t xml:space="preserve">.</w:t>
+      </w:r>
+    </w:p>
+    <w:bookmarkEnd w:id="14"/>
+    <w:bookmarkEnd w:id="15"/>
+    <w:bookmarkStart w:id="16" w:name="safety-layer-the-reviewers-exact-concern"/>
+    <w:p>
+      <w:pPr>
+        <w:pStyle w:val="Heading2"/>
+      </w:pPr>
+      <w:r>
+        <w:t xml:space="preserve">Safety layer (the reviewer’s exact concern)</w:t>
+      </w:r>
+    </w:p>
+    <w:p>
+      <w:pPr>
+        <w:pStyle w:val="FirstParagraph"/>
+      </w:pPr>
+      <w:r>
+        <w:t xml:space="preserve">Scoped mode does, in order:</w:t>
       </w:r>
     </w:p>
     <w:p>
@@ -1271,55 +1810,20 @@
         <w:pStyle w:val="Compact"/>
         <w:numPr>
           <w:ilvl w:val="0"/>
-          <w:numId w:val="1003"/>
+          <w:numId w:val="1004"/>
         </w:numPr>
       </w:pPr>
       <w:r>
-        <w:t xml:space="preserve">Only if the staged set is an exact match for the declared scope</w:t>
-      </w:r>
-      <w:r>
-        <w:t xml:space="preserve"> </w:t>
-      </w:r>
-      <w:r>
-        <w:t xml:space="preserve">does</w:t>
-      </w:r>
-      <w:r>
-        <w:t xml:space="preserve"> </w:t>
-      </w:r>
-      <w:r>
-        <w:rPr>
-          <w:rStyle w:val="VerbatimChar"/>
-        </w:rPr>
-        <w:t xml:space="preserve">git commit</w:t>
-      </w:r>
-      <w:r>
-        <w:t xml:space="preserve"> </w:t>
-      </w:r>
-      <w:r>
-        <w:t xml:space="preserve">run.</w:t>
-      </w:r>
-    </w:p>
-    <w:p>
-      <w:pPr>
-        <w:pStyle w:val="FirstParagraph"/>
-      </w:pPr>
-      <w:r>
-        <w:t xml:space="preserve">This directly implements the reviewer’s request: verify</w:t>
-      </w:r>
-      <w:r>
-        <w:t xml:space="preserve"> </w:t>
-      </w:r>
-      <w:r>
-        <w:rPr>
-          <w:rStyle w:val="VerbatimChar"/>
-        </w:rPr>
-        <w:t xml:space="preserve">git status --short</w:t>
-      </w:r>
-      <w:r>
-        <w:t xml:space="preserve"> </w:t>
-      </w:r>
-      <w:r>
-        <w:t xml:space="preserve">shows</w:t>
+        <w:rPr>
+          <w:rStyle w:val="VerbatimChar"/>
+        </w:rPr>
+        <w:t xml:space="preserve">git add -- &lt;scope-path-1&gt; &lt;scope-path-2&gt; ...</w:t>
+      </w:r>
+      <w:r>
+        <w:t xml:space="preserve"> </w:t>
+      </w:r>
+      <w:r>
+        <w:t xml:space="preserve">— stage</w:t>
       </w:r>
       <w:r>
         <w:t xml:space="preserve"> </w:t>
@@ -1335,67 +1839,58 @@
         <w:t xml:space="preserve"> </w:t>
       </w:r>
       <w:r>
-        <w:t xml:space="preserve">files in the declared scope before</w:t>
-      </w:r>
-      <w:r>
-        <w:t xml:space="preserve"> </w:t>
-      </w:r>
-      <w:r>
-        <w:t xml:space="preserve">committing, and reject with an actionable message if extra files</w:t>
-      </w:r>
-      <w:r>
-        <w:t xml:space="preserve"> </w:t>
-      </w:r>
-      <w:r>
-        <w:t xml:space="preserve">appear staged.</w:t>
-      </w:r>
-    </w:p>
-    <w:bookmarkEnd w:id="15"/>
-    <w:bookmarkStart w:id="16" w:name="backwards-compatibility"/>
-    <w:p>
-      <w:pPr>
-        <w:pStyle w:val="Heading2"/>
-      </w:pPr>
-      <w:r>
-        <w:t xml:space="preserve">Backwards compatibility</w:t>
-      </w:r>
-    </w:p>
-    <w:p>
-      <w:pPr>
-        <w:pStyle w:val="FirstParagraph"/>
-      </w:pPr>
-      <w:r>
-        <w:t xml:space="preserve">Existing callers that invoke</w:t>
-      </w:r>
-      <w:r>
-        <w:t xml:space="preserve"> </w:t>
-      </w:r>
-      <w:r>
-        <w:rPr>
-          <w:rStyle w:val="VerbatimChar"/>
-        </w:rPr>
-        <w:t xml:space="preserve">commit-push-all.sh "message"</w:t>
-      </w:r>
-      <w:r>
-        <w:t xml:space="preserve"> </w:t>
-      </w:r>
-      <w:r>
-        <w:t xml:space="preserve">with no</w:t>
-      </w:r>
-      <w:r>
-        <w:t xml:space="preserve"> </w:t>
-      </w:r>
-      <w:r>
-        <w:rPr>
-          <w:rStyle w:val="VerbatimChar"/>
-        </w:rPr>
-        <w:t xml:space="preserve">--scope</w:t>
-      </w:r>
-      <w:r>
-        <w:t xml:space="preserve"> </w:t>
-      </w:r>
-      <w:r>
-        <w:t xml:space="preserve">flag are</w:t>
+        <w:t xml:space="preserve">the</w:t>
+      </w:r>
+      <w:r>
+        <w:t xml:space="preserve"> </w:t>
+      </w:r>
+      <w:r>
+        <w:t xml:space="preserve">declared paths. Never</w:t>
+      </w:r>
+      <w:r>
+        <w:t xml:space="preserve"> </w:t>
+      </w:r>
+      <w:r>
+        <w:rPr>
+          <w:rStyle w:val="VerbatimChar"/>
+        </w:rPr>
+        <w:t xml:space="preserve">git add -A</w:t>
+      </w:r>
+      <w:r>
+        <w:t xml:space="preserve">.</w:t>
+      </w:r>
+    </w:p>
+    <w:p>
+      <w:pPr>
+        <w:pStyle w:val="Compact"/>
+        <w:numPr>
+          <w:ilvl w:val="0"/>
+          <w:numId w:val="1004"/>
+        </w:numPr>
+      </w:pPr>
+      <w:r>
+        <w:t xml:space="preserve">Read the resulting staged set (</w:t>
+      </w:r>
+      <w:r>
+        <w:rPr>
+          <w:rStyle w:val="VerbatimChar"/>
+        </w:rPr>
+        <w:t xml:space="preserve">git diff --cached --name-only</w:t>
+      </w:r>
+      <w:r>
+        <w:t xml:space="preserve">).</w:t>
+      </w:r>
+    </w:p>
+    <w:p>
+      <w:pPr>
+        <w:pStyle w:val="Compact"/>
+        <w:numPr>
+          <w:ilvl w:val="0"/>
+          <w:numId w:val="1004"/>
+        </w:numPr>
+      </w:pPr>
+      <w:r>
+        <w:t xml:space="preserve">For every staged path, confirm it</w:t>
       </w:r>
       <w:r>
         <w:t xml:space="preserve"> </w:t>
@@ -1405,19 +1900,83 @@
           <w:b/>
           <w:bCs/>
         </w:rPr>
-        <w:t xml:space="preserve">completely unaffected</w:t>
-      </w:r>
-      <w:r>
-        <w:t xml:space="preserve"> </w:t>
-      </w:r>
-      <w:r>
-        <w:t xml:space="preserve">— the default path is</w:t>
-      </w:r>
-      <w:r>
-        <w:t xml:space="preserve"> </w:t>
-      </w:r>
-      <w:r>
-        <w:t xml:space="preserve">byte-for-byte the same</w:t>
+        <w:t xml:space="preserve">equals</w:t>
+      </w:r>
+      <w:r>
+        <w:t xml:space="preserve"> </w:t>
+      </w:r>
+      <w:r>
+        <w:t xml:space="preserve">a declared scope entry</w:t>
+      </w:r>
+      <w:r>
+        <w:t xml:space="preserve"> </w:t>
+      </w:r>
+      <w:r>
+        <w:t xml:space="preserve">or sits</w:t>
+      </w:r>
+      <w:r>
+        <w:t xml:space="preserve"> </w:t>
+      </w:r>
+      <w:r>
+        <w:rPr>
+          <w:b/>
+          <w:bCs/>
+        </w:rPr>
+        <w:t xml:space="preserve">under</w:t>
+      </w:r>
+      <w:r>
+        <w:t xml:space="preserve"> </w:t>
+      </w:r>
+      <w:r>
+        <w:t xml:space="preserve">one (a declared scope entry may be a directory</w:t>
+      </w:r>
+      <w:r>
+        <w:t xml:space="preserve"> </w:t>
+      </w:r>
+      <w:r>
+        <w:t xml:space="preserve">prefix). This is a structural match, never a substring match</w:t>
+      </w:r>
+      <w:r>
+        <w:t xml:space="preserve"> </w:t>
+      </w:r>
+      <w:r>
+        <w:t xml:space="preserve">(§11.4.201(7)(a)).</w:t>
+      </w:r>
+    </w:p>
+    <w:p>
+      <w:pPr>
+        <w:pStyle w:val="Compact"/>
+        <w:numPr>
+          <w:ilvl w:val="0"/>
+          <w:numId w:val="1004"/>
+        </w:numPr>
+      </w:pPr>
+      <w:r>
+        <w:t xml:space="preserve">If anything staged falls outside the declared scope — e.g. a</w:t>
+      </w:r>
+      <w:r>
+        <w:t xml:space="preserve"> </w:t>
+      </w:r>
+      <w:r>
+        <w:t xml:space="preserve">concurrent subagent’s own</w:t>
+      </w:r>
+      <w:r>
+        <w:t xml:space="preserve"> </w:t>
+      </w:r>
+      <w:r>
+        <w:rPr>
+          <w:rStyle w:val="VerbatimChar"/>
+        </w:rPr>
+        <w:t xml:space="preserve">git add</w:t>
+      </w:r>
+      <w:r>
+        <w:t xml:space="preserve">, or residue from an earlier</w:t>
+      </w:r>
+      <w:r>
+        <w:t xml:space="preserve"> </w:t>
+      </w:r>
+      <w:r>
+        <w:t xml:space="preserve">unscoped</w:t>
       </w:r>
       <w:r>
         <w:t xml:space="preserve"> </w:t>
@@ -1432,80 +1991,71 @@
         <w:t xml:space="preserve"> </w:t>
       </w:r>
       <w:r>
-        <w:t xml:space="preserve">→ commit → push flow that existed</w:t>
-      </w:r>
-      <w:r>
-        <w:t xml:space="preserve"> </w:t>
-      </w:r>
-      <w:r>
-        <w:t xml:space="preserve">before task #66.</w:t>
-      </w:r>
-      <w:r>
-        <w:t xml:space="preserve"> </w:t>
-      </w:r>
-      <w:r>
-        <w:rPr>
-          <w:rStyle w:val="VerbatimChar"/>
-        </w:rPr>
-        <w:t xml:space="preserve">--scope</w:t>
-      </w:r>
-      <w:r>
-        <w:t xml:space="preserve"> </w:t>
-      </w:r>
-      <w:r>
-        <w:t xml:space="preserve">is purely additive. The known BOB-068</w:t>
-      </w:r>
-      <w:r>
-        <w:t xml:space="preserve"> </w:t>
-      </w:r>
-      <w:r>
-        <w:t xml:space="preserve">hazard remains present in default mode (that’s the</w:t>
-      </w:r>
-      <w:r>
-        <w:t xml:space="preserve"> </w:t>
-      </w:r>
-      <w:r>
-        <w:t xml:space="preserve">“known existing</w:t>
-      </w:r>
-      <w:r>
-        <w:t xml:space="preserve"> </w:t>
-      </w:r>
-      <w:r>
-        <w:t xml:space="preserve">dependency”</w:t>
-      </w:r>
-      <w:r>
-        <w:t xml:space="preserve"> </w:t>
-      </w:r>
-      <w:r>
-        <w:t xml:space="preserve">the task brief accepts) — new dispatches are the ones</w:t>
-      </w:r>
-      <w:r>
-        <w:t xml:space="preserve"> </w:t>
-      </w:r>
-      <w:r>
-        <w:t xml:space="preserve">expected to move to</w:t>
-      </w:r>
-      <w:r>
-        <w:t xml:space="preserve"> </w:t>
-      </w:r>
-      <w:r>
-        <w:rPr>
-          <w:rStyle w:val="VerbatimChar"/>
-        </w:rPr>
-        <w:t xml:space="preserve">--scope</w:t>
-      </w:r>
-      <w:r>
-        <w:t xml:space="preserve">.</w:t>
-      </w:r>
-    </w:p>
-    <w:bookmarkEnd w:id="16"/>
-    <w:bookmarkStart w:id="17" w:name="X0818dc16024856ae9d2ac558a90ab4a922fe9d1"/>
-    <w:p>
-      <w:pPr>
-        <w:pStyle w:val="Heading2"/>
-      </w:pPr>
-      <w:r>
-        <w:t xml:space="preserve">Guidance for SDD / subagent task dispatches</w:t>
+        <w:t xml:space="preserve">that never got committed — the commit is</w:t>
+      </w:r>
+      <w:r>
+        <w:t xml:space="preserve"> </w:t>
+      </w:r>
+      <w:r>
+        <w:rPr>
+          <w:b/>
+          <w:bCs/>
+        </w:rPr>
+        <w:t xml:space="preserve">REJECTED</w:t>
+      </w:r>
+      <w:r>
+        <w:t xml:space="preserve"> </w:t>
+      </w:r>
+      <w:r>
+        <w:t xml:space="preserve">(exit 1) with every unexpected path printed, plus a</w:t>
+      </w:r>
+      <w:r>
+        <w:t xml:space="preserve"> </w:t>
+      </w:r>
+      <w:r>
+        <w:t xml:space="preserve">remediation pointer (</w:t>
+      </w:r>
+      <w:r>
+        <w:rPr>
+          <w:rStyle w:val="VerbatimChar"/>
+        </w:rPr>
+        <w:t xml:space="preserve">git restore --staged &lt;file&gt;</w:t>
+      </w:r>
+      <w:r>
+        <w:t xml:space="preserve">).</w:t>
+      </w:r>
+    </w:p>
+    <w:p>
+      <w:pPr>
+        <w:pStyle w:val="Compact"/>
+        <w:numPr>
+          <w:ilvl w:val="0"/>
+          <w:numId w:val="1004"/>
+        </w:numPr>
+      </w:pPr>
+      <w:r>
+        <w:t xml:space="preserve">Only if the staged set is an exact match for the declared scope</w:t>
+      </w:r>
+      <w:r>
+        <w:t xml:space="preserve"> </w:t>
+      </w:r>
+      <w:r>
+        <w:t xml:space="preserve">does</w:t>
+      </w:r>
+      <w:r>
+        <w:t xml:space="preserve"> </w:t>
+      </w:r>
+      <w:r>
+        <w:rPr>
+          <w:rStyle w:val="VerbatimChar"/>
+        </w:rPr>
+        <w:t xml:space="preserve">git commit</w:t>
+      </w:r>
+      <w:r>
+        <w:t xml:space="preserve"> </w:t>
+      </w:r>
+      <w:r>
+        <w:t xml:space="preserve">run.</w:t>
       </w:r>
     </w:p>
     <w:p>
@@ -1513,73 +2063,22 @@
         <w:pStyle w:val="FirstParagraph"/>
       </w:pPr>
       <w:r>
-        <w:t xml:space="preserve">Going forward, task briefs that dispatch parallel subagents with a</w:t>
-      </w:r>
-      <w:r>
-        <w:t xml:space="preserve"> </w:t>
-      </w:r>
-      <w:r>
-        <w:t xml:space="preserve">declared, disjoint file scope (the normal SDD dispatch shape) SHOULD</w:t>
-      </w:r>
-      <w:r>
-        <w:t xml:space="preserve"> </w:t>
-      </w:r>
-      <w:r>
-        <w:t xml:space="preserve">have their subagent’s final commit go through</w:t>
-      </w:r>
-      <w:r>
-        <w:t xml:space="preserve"> </w:t>
-      </w:r>
-      <w:r>
-        <w:rPr>
-          <w:rStyle w:val="VerbatimChar"/>
-        </w:rPr>
-        <w:t xml:space="preserve">commit-push-all.sh --scope &lt;declared-scope-paths&gt;</w:t>
-      </w:r>
-      <w:r>
-        <w:t xml:space="preserve"> </w:t>
-      </w:r>
-      <w:r>
-        <w:t xml:space="preserve">rather than the bare unscoped form —</w:t>
-      </w:r>
-      <w:r>
-        <w:t xml:space="preserve"> </w:t>
-      </w:r>
-      <w:r>
-        <w:t xml:space="preserve">this is exactly the case</w:t>
-      </w:r>
-      <w:r>
-        <w:t xml:space="preserve"> </w:t>
-      </w:r>
-      <w:r>
-        <w:rPr>
-          <w:rStyle w:val="VerbatimChar"/>
-        </w:rPr>
-        <w:t xml:space="preserve">--scope</w:t>
-      </w:r>
-      <w:r>
-        <w:t xml:space="preserve"> </w:t>
-      </w:r>
-      <w:r>
-        <w:t xml:space="preserve">was built for, and it turns the</w:t>
-      </w:r>
-      <w:r>
-        <w:t xml:space="preserve"> </w:t>
-      </w:r>
-      <w:r>
-        <w:t xml:space="preserve">brief’s own</w:t>
-      </w:r>
-      <w:r>
-        <w:t xml:space="preserve"> </w:t>
-      </w:r>
-      <w:r>
-        <w:t xml:space="preserve">“disjoint scope”</w:t>
-      </w:r>
-      <w:r>
-        <w:t xml:space="preserve"> </w:t>
-      </w:r>
-      <w:r>
-        <w:t xml:space="preserve">declaration into a</w:t>
+        <w:t xml:space="preserve">This directly implements the reviewer’s request: verify</w:t>
+      </w:r>
+      <w:r>
+        <w:t xml:space="preserve"> </w:t>
+      </w:r>
+      <w:r>
+        <w:rPr>
+          <w:rStyle w:val="VerbatimChar"/>
+        </w:rPr>
+        <w:t xml:space="preserve">git status --short</w:t>
+      </w:r>
+      <w:r>
+        <w:t xml:space="preserve"> </w:t>
+      </w:r>
+      <w:r>
+        <w:t xml:space="preserve">shows</w:t>
       </w:r>
       <w:r>
         <w:t xml:space="preserve"> </w:t>
@@ -1589,20 +2088,280 @@
           <w:i/>
           <w:iCs/>
         </w:rPr>
-        <w:t xml:space="preserve">mechanically</w:t>
+        <w:t xml:space="preserve">only</w:t>
+      </w:r>
+      <w:r>
+        <w:t xml:space="preserve"> </w:t>
+      </w:r>
+      <w:r>
+        <w:t xml:space="preserve">files in the declared scope before</w:t>
+      </w:r>
+      <w:r>
+        <w:t xml:space="preserve"> </w:t>
+      </w:r>
+      <w:r>
+        <w:t xml:space="preserve">committing, and reject with an actionable message if extra files</w:t>
+      </w:r>
+      <w:r>
+        <w:t xml:space="preserve"> </w:t>
+      </w:r>
+      <w:r>
+        <w:t xml:space="preserve">appear staged.</w:t>
+      </w:r>
+    </w:p>
+    <w:bookmarkEnd w:id="16"/>
+    <w:bookmarkStart w:id="17" w:name="backwards-compatibility"/>
+    <w:p>
+      <w:pPr>
+        <w:pStyle w:val="Heading2"/>
+      </w:pPr>
+      <w:r>
+        <w:t xml:space="preserve">Backwards compatibility</w:t>
+      </w:r>
+    </w:p>
+    <w:p>
+      <w:pPr>
+        <w:pStyle w:val="FirstParagraph"/>
+      </w:pPr>
+      <w:r>
+        <w:t xml:space="preserve">Existing callers that invoke</w:t>
+      </w:r>
+      <w:r>
+        <w:t xml:space="preserve"> </w:t>
+      </w:r>
+      <w:r>
+        <w:rPr>
+          <w:rStyle w:val="VerbatimChar"/>
+        </w:rPr>
+        <w:t xml:space="preserve">commit-push-all.sh "message"</w:t>
+      </w:r>
+      <w:r>
+        <w:t xml:space="preserve"> </w:t>
+      </w:r>
+      <w:r>
+        <w:t xml:space="preserve">with no</w:t>
+      </w:r>
+      <w:r>
+        <w:t xml:space="preserve"> </w:t>
+      </w:r>
+      <w:r>
+        <w:rPr>
+          <w:rStyle w:val="VerbatimChar"/>
+        </w:rPr>
+        <w:t xml:space="preserve">--scope</w:t>
+      </w:r>
+      <w:r>
+        <w:t xml:space="preserve"> </w:t>
+      </w:r>
+      <w:r>
+        <w:t xml:space="preserve">flag are</w:t>
+      </w:r>
+      <w:r>
+        <w:t xml:space="preserve"> </w:t>
+      </w:r>
+      <w:r>
+        <w:rPr>
+          <w:b/>
+          <w:bCs/>
+        </w:rPr>
+        <w:t xml:space="preserve">completely unaffected</w:t>
+      </w:r>
+      <w:r>
+        <w:t xml:space="preserve"> </w:t>
+      </w:r>
+      <w:r>
+        <w:t xml:space="preserve">— the default path is</w:t>
+      </w:r>
+      <w:r>
+        <w:t xml:space="preserve"> </w:t>
+      </w:r>
+      <w:r>
+        <w:t xml:space="preserve">byte-for-byte the same</w:t>
+      </w:r>
+      <w:r>
+        <w:t xml:space="preserve"> </w:t>
+      </w:r>
+      <w:r>
+        <w:rPr>
+          <w:rStyle w:val="VerbatimChar"/>
+        </w:rPr>
+        <w:t xml:space="preserve">git add -A</w:t>
+      </w:r>
+      <w:r>
+        <w:t xml:space="preserve"> </w:t>
+      </w:r>
+      <w:r>
+        <w:t xml:space="preserve">→ commit → push flow that existed</w:t>
+      </w:r>
+      <w:r>
+        <w:t xml:space="preserve"> </w:t>
+      </w:r>
+      <w:r>
+        <w:t xml:space="preserve">before task #66.</w:t>
+      </w:r>
+      <w:r>
+        <w:t xml:space="preserve"> </w:t>
+      </w:r>
+      <w:r>
+        <w:rPr>
+          <w:rStyle w:val="VerbatimChar"/>
+        </w:rPr>
+        <w:t xml:space="preserve">--scope</w:t>
+      </w:r>
+      <w:r>
+        <w:t xml:space="preserve"> </w:t>
+      </w:r>
+      <w:r>
+        <w:t xml:space="preserve">is purely additive. The known BOB-068</w:t>
+      </w:r>
+      <w:r>
+        <w:t xml:space="preserve"> </w:t>
+      </w:r>
+      <w:r>
+        <w:t xml:space="preserve">hazard remains present in default mode (that’s the</w:t>
+      </w:r>
+      <w:r>
+        <w:t xml:space="preserve"> </w:t>
+      </w:r>
+      <w:r>
+        <w:t xml:space="preserve">“known existing</w:t>
+      </w:r>
+      <w:r>
+        <w:t xml:space="preserve"> </w:t>
+      </w:r>
+      <w:r>
+        <w:t xml:space="preserve">dependency”</w:t>
+      </w:r>
+      <w:r>
+        <w:t xml:space="preserve"> </w:t>
+      </w:r>
+      <w:r>
+        <w:t xml:space="preserve">the task brief accepts) — new dispatches are the ones</w:t>
+      </w:r>
+      <w:r>
+        <w:t xml:space="preserve"> </w:t>
+      </w:r>
+      <w:r>
+        <w:t xml:space="preserve">expected to move to</w:t>
+      </w:r>
+      <w:r>
+        <w:t xml:space="preserve"> </w:t>
+      </w:r>
+      <w:r>
+        <w:rPr>
+          <w:rStyle w:val="VerbatimChar"/>
+        </w:rPr>
+        <w:t xml:space="preserve">--scope</w:t>
+      </w:r>
+      <w:r>
+        <w:t xml:space="preserve">.</w:t>
+      </w:r>
+    </w:p>
+    <w:bookmarkEnd w:id="17"/>
+    <w:bookmarkStart w:id="18" w:name="X0818dc16024856ae9d2ac558a90ab4a922fe9d1"/>
+    <w:p>
+      <w:pPr>
+        <w:pStyle w:val="Heading2"/>
+      </w:pPr>
+      <w:r>
+        <w:t xml:space="preserve">Guidance for SDD / subagent task dispatches</w:t>
+      </w:r>
+    </w:p>
+    <w:p>
+      <w:pPr>
+        <w:pStyle w:val="FirstParagraph"/>
+      </w:pPr>
+      <w:r>
+        <w:t xml:space="preserve">Going forward, task briefs that dispatch parallel subagents with a</w:t>
+      </w:r>
+      <w:r>
+        <w:t xml:space="preserve"> </w:t>
+      </w:r>
+      <w:r>
+        <w:t xml:space="preserve">declared, disjoint file scope (the normal SDD dispatch shape) SHOULD</w:t>
+      </w:r>
+      <w:r>
+        <w:t xml:space="preserve"> </w:t>
+      </w:r>
+      <w:r>
+        <w:t xml:space="preserve">have their subagent’s final commit go through</w:t>
+      </w:r>
+      <w:r>
+        <w:t xml:space="preserve"> </w:t>
+      </w:r>
+      <w:r>
+        <w:rPr>
+          <w:rStyle w:val="VerbatimChar"/>
+        </w:rPr>
+        <w:t xml:space="preserve">commit-push-all.sh --scope &lt;declared-scope-paths&gt;</w:t>
+      </w:r>
+      <w:r>
+        <w:t xml:space="preserve"> </w:t>
+      </w:r>
+      <w:r>
+        <w:t xml:space="preserve">rather than the bare unscoped form —</w:t>
+      </w:r>
+      <w:r>
+        <w:t xml:space="preserve"> </w:t>
+      </w:r>
+      <w:r>
+        <w:t xml:space="preserve">this is exactly the case</w:t>
+      </w:r>
+      <w:r>
+        <w:t xml:space="preserve"> </w:t>
+      </w:r>
+      <w:r>
+        <w:rPr>
+          <w:rStyle w:val="VerbatimChar"/>
+        </w:rPr>
+        <w:t xml:space="preserve">--scope</w:t>
+      </w:r>
+      <w:r>
+        <w:t xml:space="preserve"> </w:t>
+      </w:r>
+      <w:r>
+        <w:t xml:space="preserve">was built for, and it turns the</w:t>
+      </w:r>
+      <w:r>
+        <w:t xml:space="preserve"> </w:t>
+      </w:r>
+      <w:r>
+        <w:t xml:space="preserve">brief’s own</w:t>
+      </w:r>
+      <w:r>
+        <w:t xml:space="preserve"> </w:t>
+      </w:r>
+      <w:r>
+        <w:t xml:space="preserve">“disjoint scope”</w:t>
+      </w:r>
+      <w:r>
+        <w:t xml:space="preserve"> </w:t>
+      </w:r>
+      <w:r>
+        <w:t xml:space="preserve">declaration into a</w:t>
+      </w:r>
+      <w:r>
+        <w:t xml:space="preserve"> </w:t>
       </w:r>
       <w:r>
         <w:rPr>
           <w:i/>
           <w:iCs/>
         </w:rPr>
-        <w:t xml:space="preserve"> </w:t>
+        <w:t xml:space="preserve">mechanically</w:t>
       </w:r>
       <w:r>
         <w:rPr>
           <w:i/>
           <w:iCs/>
         </w:rPr>
+        <w:t xml:space="preserve"> </w:t>
+      </w:r>
+      <w:r>
+        <w:rPr>
+          <w:i/>
+          <w:iCs/>
+        </w:rPr>
         <w:t xml:space="preserve">enforced</w:t>
       </w:r>
       <w:r>
@@ -1657,8 +2416,8 @@
         <w:t xml:space="preserve">the intended scope.</w:t>
       </w:r>
     </w:p>
-    <w:bookmarkEnd w:id="17"/>
-    <w:bookmarkStart w:id="18" w:name="environment-knobs"/>
+    <w:bookmarkEnd w:id="18"/>
+    <w:bookmarkStart w:id="19" w:name="environment-knobs"/>
     <w:p>
       <w:pPr>
         <w:pStyle w:val="Heading2"/>
@@ -1820,8 +2579,8 @@
         </w:tc>
       </w:tr>
     </w:tbl>
-    <w:bookmarkEnd w:id="18"/>
-    <w:bookmarkStart w:id="19" w:name="exit-codes"/>
+    <w:bookmarkEnd w:id="19"/>
+    <w:bookmarkStart w:id="20" w:name="exit-codes"/>
     <w:p>
       <w:pPr>
         <w:pStyle w:val="Heading2"/>
@@ -1980,7 +2739,7 @@
               <w:pStyle w:val="Compact"/>
             </w:pPr>
             <w:r>
-              <w:t xml:space="preserve">Invocation error (missing commit message, malformed</w:t>
+              <w:t xml:space="preserve">Invocation error: missing, empty or duplicated message, extra positional argument, malformed</w:t>
             </w:r>
             <w:r>
               <w:t xml:space="preserve"> </w:t>
@@ -1992,7 +2751,43 @@
               <w:t xml:space="preserve">--scope</w:t>
             </w:r>
             <w:r>
-              <w:t xml:space="preserve">, unknown flag).</w:t>
+              <w:t xml:space="preserve">/</w:t>
+            </w:r>
+            <w:r>
+              <w:rPr>
+                <w:rStyle w:val="VerbatimChar"/>
+              </w:rPr>
+              <w:t xml:space="preserve">--message-file</w:t>
+            </w:r>
+            <w:r>
+              <w:t xml:space="preserve">, a</w:t>
+            </w:r>
+            <w:r>
+              <w:t xml:space="preserve"> </w:t>
+            </w:r>
+            <w:r>
+              <w:rPr>
+                <w:rStyle w:val="VerbatimChar"/>
+              </w:rPr>
+              <w:t xml:space="preserve">--scope</w:t>
+            </w:r>
+            <w:r>
+              <w:t xml:space="preserve"> </w:t>
+            </w:r>
+            <w:r>
+              <w:t xml:space="preserve">token after</w:t>
+            </w:r>
+            <w:r>
+              <w:t xml:space="preserve"> </w:t>
+            </w:r>
+            <w:r>
+              <w:rPr>
+                <w:rStyle w:val="VerbatimChar"/>
+              </w:rPr>
+              <w:t xml:space="preserve">--</w:t>
+            </w:r>
+            <w:r>
+              <w:t xml:space="preserve">, unknown flag. Nothing is committed.</w:t>
             </w:r>
           </w:p>
         </w:tc>
@@ -2037,318 +2832,14 @@
         </w:tc>
       </w:tr>
     </w:tbl>
-    <w:bookmarkEnd w:id="19"/>
-    <w:bookmarkStart w:id="20" w:name="edge-cases"/>
+    <w:bookmarkEnd w:id="20"/>
+    <w:bookmarkStart w:id="21" w:name="edge-cases"/>
     <w:p>
       <w:pPr>
         <w:pStyle w:val="Heading2"/>
       </w:pPr>
       <w:r>
         <w:t xml:space="preserve">Edge cases</w:t>
-      </w:r>
-    </w:p>
-    <w:p>
-      <w:pPr>
-        <w:pStyle w:val="Compact"/>
-        <w:numPr>
-          <w:ilvl w:val="0"/>
-          <w:numId w:val="1004"/>
-        </w:numPr>
-      </w:pPr>
-      <w:r>
-        <w:rPr>
-          <w:b/>
-          <w:bCs/>
-        </w:rPr>
-        <w:t xml:space="preserve">Scope path doesn’t exist.</w:t>
-      </w:r>
-      <w:r>
-        <w:t xml:space="preserve"> </w:t>
-      </w:r>
-      <w:r>
-        <w:rPr>
-          <w:rStyle w:val="VerbatimChar"/>
-        </w:rPr>
-        <w:t xml:space="preserve">git add -- &lt;path&gt;</w:t>
-      </w:r>
-      <w:r>
-        <w:t xml:space="preserve"> </w:t>
-      </w:r>
-      <w:r>
-        <w:t xml:space="preserve">fails immediately</w:t>
-      </w:r>
-      <w:r>
-        <w:t xml:space="preserve"> </w:t>
-      </w:r>
-      <w:r>
-        <w:t xml:space="preserve">(</w:t>
-      </w:r>
-      <w:r>
-        <w:rPr>
-          <w:rStyle w:val="VerbatimChar"/>
-        </w:rPr>
-        <w:t xml:space="preserve">fatal: pathspec '...' did not match any files</w:t>
-      </w:r>
-      <w:r>
-        <w:t xml:space="preserve">); under</w:t>
-      </w:r>
-      <w:r>
-        <w:t xml:space="preserve"> </w:t>
-      </w:r>
-      <w:r>
-        <w:rPr>
-          <w:rStyle w:val="VerbatimChar"/>
-        </w:rPr>
-        <w:t xml:space="preserve">set -e</w:t>
-      </w:r>
-      <w:r>
-        <w:t xml:space="preserve"> </w:t>
-      </w:r>
-      <w:r>
-        <w:t xml:space="preserve">the script exits with git’s own error — no silent no-op.</w:t>
-      </w:r>
-    </w:p>
-    <w:p>
-      <w:pPr>
-        <w:pStyle w:val="Compact"/>
-        <w:numPr>
-          <w:ilvl w:val="0"/>
-          <w:numId w:val="1004"/>
-        </w:numPr>
-      </w:pPr>
-      <w:r>
-        <w:rPr>
-          <w:rStyle w:val="VerbatimChar"/>
-          <w:b/>
-          <w:bCs/>
-        </w:rPr>
-        <w:t xml:space="preserve">--scope</w:t>
-      </w:r>
-      <w:r>
-        <w:rPr>
-          <w:b/>
-          <w:bCs/>
-        </w:rPr>
-        <w:t xml:space="preserve"> </w:t>
-      </w:r>
-      <w:r>
-        <w:rPr>
-          <w:b/>
-          <w:bCs/>
-        </w:rPr>
-        <w:t xml:space="preserve">with zero matching changes.</w:t>
-      </w:r>
-      <w:r>
-        <w:t xml:space="preserve"> </w:t>
-      </w:r>
-      <w:r>
-        <w:t xml:space="preserve">If the declared path has</w:t>
-      </w:r>
-      <w:r>
-        <w:t xml:space="preserve"> </w:t>
-      </w:r>
-      <w:r>
-        <w:t xml:space="preserve">no working-tree delta,</w:t>
-      </w:r>
-      <w:r>
-        <w:t xml:space="preserve"> </w:t>
-      </w:r>
-      <w:r>
-        <w:rPr>
-          <w:rStyle w:val="VerbatimChar"/>
-        </w:rPr>
-        <w:t xml:space="preserve">git diff --cached --quiet</w:t>
-      </w:r>
-      <w:r>
-        <w:t xml:space="preserve"> </w:t>
-      </w:r>
-      <w:r>
-        <w:t xml:space="preserve">is true after</w:t>
-      </w:r>
-      <w:r>
-        <w:t xml:space="preserve"> </w:t>
-      </w:r>
-      <w:r>
-        <w:rPr>
-          <w:rStyle w:val="VerbatimChar"/>
-        </w:rPr>
-        <w:t xml:space="preserve">git add</w:t>
-      </w:r>
-      <w:r>
-        <w:t xml:space="preserve">, and the script logs</w:t>
-      </w:r>
-      <w:r>
-        <w:t xml:space="preserve"> </w:t>
-      </w:r>
-      <w:r>
-        <w:t xml:space="preserve">“nothing to commit”</w:t>
-      </w:r>
-      <w:r>
-        <w:t xml:space="preserve"> </w:t>
-      </w:r>
-      <w:r>
-        <w:t xml:space="preserve">and proceeds</w:t>
-      </w:r>
-      <w:r>
-        <w:t xml:space="preserve"> </w:t>
-      </w:r>
-      <w:r>
-        <w:t xml:space="preserve">straight to the push stage (same as default mode).</w:t>
-      </w:r>
-    </w:p>
-    <w:p>
-      <w:pPr>
-        <w:pStyle w:val="Compact"/>
-        <w:numPr>
-          <w:ilvl w:val="0"/>
-          <w:numId w:val="1004"/>
-        </w:numPr>
-      </w:pPr>
-      <w:r>
-        <w:rPr>
-          <w:b/>
-          <w:bCs/>
-        </w:rPr>
-        <w:t xml:space="preserve">Directory scope.</w:t>
-      </w:r>
-      <w:r>
-        <w:t xml:space="preserve"> </w:t>
-      </w:r>
-      <w:r>
-        <w:rPr>
-          <w:rStyle w:val="VerbatimChar"/>
-        </w:rPr>
-        <w:t xml:space="preserve">--scope some/dir</w:t>
-      </w:r>
-      <w:r>
-        <w:t xml:space="preserve"> </w:t>
-      </w:r>
-      <w:r>
-        <w:t xml:space="preserve">stages the whole subtree</w:t>
-      </w:r>
-      <w:r>
-        <w:t xml:space="preserve"> </w:t>
-      </w:r>
-      <w:r>
-        <w:t xml:space="preserve">under</w:t>
-      </w:r>
-      <w:r>
-        <w:t xml:space="preserve"> </w:t>
-      </w:r>
-      <w:r>
-        <w:rPr>
-          <w:rStyle w:val="VerbatimChar"/>
-        </w:rPr>
-        <w:t xml:space="preserve">some/dir</w:t>
-      </w:r>
-      <w:r>
-        <w:t xml:space="preserve">; the safety check’s prefix match (</w:t>
-      </w:r>
-      <w:r>
-        <w:rPr>
-          <w:rStyle w:val="VerbatimChar"/>
-        </w:rPr>
-        <w:t xml:space="preserve">some/dir/...</w:t>
-      </w:r>
-      <w:r>
-        <w:t xml:space="preserve">)</w:t>
-      </w:r>
-      <w:r>
-        <w:t xml:space="preserve"> </w:t>
-      </w:r>
-      <w:r>
-        <w:t xml:space="preserve">accepts any staged path under it.</w:t>
-      </w:r>
-    </w:p>
-    <w:p>
-      <w:pPr>
-        <w:pStyle w:val="Compact"/>
-        <w:numPr>
-          <w:ilvl w:val="0"/>
-          <w:numId w:val="1004"/>
-        </w:numPr>
-      </w:pPr>
-      <w:r>
-        <w:rPr>
-          <w:b/>
-          <w:bCs/>
-        </w:rPr>
-        <w:t xml:space="preserve">Mixing scoped and unscoped semantics.</w:t>
-      </w:r>
-      <w:r>
-        <w:t xml:space="preserve"> </w:t>
-      </w:r>
-      <w:r>
-        <w:t xml:space="preserve">There is no flag to mix</w:t>
-      </w:r>
-      <w:r>
-        <w:t xml:space="preserve"> </w:t>
-      </w:r>
-      <w:r>
-        <w:t xml:space="preserve">“some declared paths + also sweep everything else”</w:t>
-      </w:r>
-      <w:r>
-        <w:t xml:space="preserve"> </w:t>
-      </w:r>
-      <w:r>
-        <w:t xml:space="preserve">— that would</w:t>
-      </w:r>
-      <w:r>
-        <w:t xml:space="preserve"> </w:t>
-      </w:r>
-      <w:r>
-        <w:t xml:space="preserve">defeat the purpose. Use two separate invocations if genuinely</w:t>
-      </w:r>
-      <w:r>
-        <w:t xml:space="preserve"> </w:t>
-      </w:r>
-      <w:r>
-        <w:t xml:space="preserve">needed.</w:t>
-      </w:r>
-    </w:p>
-    <w:bookmarkEnd w:id="20"/>
-    <w:bookmarkStart w:id="21" w:name="anti-bluff-verification"/>
-    <w:p>
-      <w:pPr>
-        <w:pStyle w:val="Heading2"/>
-      </w:pPr>
-      <w:r>
-        <w:t xml:space="preserve">Anti-bluff verification</w:t>
-      </w:r>
-    </w:p>
-    <w:p>
-      <w:pPr>
-        <w:pStyle w:val="FirstParagraph"/>
-      </w:pPr>
-      <w:r>
-        <w:rPr>
-          <w:rStyle w:val="VerbatimChar"/>
-        </w:rPr>
-        <w:t xml:space="preserve">challenges/scripts/commit_push_all_scope_challenge.sh</w:t>
-      </w:r>
-      <w:r>
-        <w:t xml:space="preserve"> </w:t>
-      </w:r>
-      <w:r>
-        <w:t xml:space="preserve">proves the</w:t>
-      </w:r>
-      <w:r>
-        <w:t xml:space="preserve"> </w:t>
-      </w:r>
-      <w:r>
-        <w:t xml:space="preserve">safety layer is real (not decorative) via §11.4.115 RED/GREEN</w:t>
-      </w:r>
-      <w:r>
-        <w:t xml:space="preserve"> </w:t>
-      </w:r>
-      <w:r>
-        <w:t xml:space="preserve">polarity, run entirely against a throwaway sandbox git repo (zero</w:t>
-      </w:r>
-      <w:r>
-        <w:t xml:space="preserve"> </w:t>
-      </w:r>
-      <w:r>
-        <w:t xml:space="preserve">remotes — never touches the real boba repo or pushes anywhere):</w:t>
       </w:r>
     </w:p>
     <w:p>
@@ -2364,35 +2855,52 @@
           <w:b/>
           <w:bCs/>
         </w:rPr>
-        <w:t xml:space="preserve">Step A (always runs):</w:t>
-      </w:r>
-      <w:r>
-        <w:t xml:space="preserve"> </w:t>
-      </w:r>
-      <w:r>
-        <w:t xml:space="preserve">a genuine single-scope commit succeeds</w:t>
-      </w:r>
-      <w:r>
-        <w:t xml:space="preserve"> </w:t>
-      </w:r>
-      <w:r>
-        <w:t xml:space="preserve">cleanly and lands</w:t>
-      </w:r>
-      <w:r>
-        <w:t xml:space="preserve"> </w:t>
-      </w:r>
-      <w:r>
-        <w:rPr>
-          <w:i/>
-          <w:iCs/>
-        </w:rPr>
-        <w:t xml:space="preserve">exactly</w:t>
-      </w:r>
-      <w:r>
-        <w:t xml:space="preserve"> </w:t>
-      </w:r>
-      <w:r>
-        <w:t xml:space="preserve">the declared file.</w:t>
+        <w:t xml:space="preserve">Scope path doesn’t exist.</w:t>
+      </w:r>
+      <w:r>
+        <w:t xml:space="preserve"> </w:t>
+      </w:r>
+      <w:r>
+        <w:rPr>
+          <w:rStyle w:val="VerbatimChar"/>
+        </w:rPr>
+        <w:t xml:space="preserve">git add -- &lt;path&gt;</w:t>
+      </w:r>
+      <w:r>
+        <w:t xml:space="preserve"> </w:t>
+      </w:r>
+      <w:r>
+        <w:t xml:space="preserve">fails immediately</w:t>
+      </w:r>
+      <w:r>
+        <w:t xml:space="preserve"> </w:t>
+      </w:r>
+      <w:r>
+        <w:t xml:space="preserve">(</w:t>
+      </w:r>
+      <w:r>
+        <w:rPr>
+          <w:rStyle w:val="VerbatimChar"/>
+        </w:rPr>
+        <w:t xml:space="preserve">fatal: pathspec '...' did not match any files</w:t>
+      </w:r>
+      <w:r>
+        <w:t xml:space="preserve">); under</w:t>
+      </w:r>
+      <w:r>
+        <w:t xml:space="preserve"> </w:t>
+      </w:r>
+      <w:r>
+        <w:rPr>
+          <w:rStyle w:val="VerbatimChar"/>
+        </w:rPr>
+        <w:t xml:space="preserve">set -e</w:t>
+      </w:r>
+      <w:r>
+        <w:t xml:space="preserve"> </w:t>
+      </w:r>
+      <w:r>
+        <w:t xml:space="preserve">the script exits with git’s own error — no silent no-op.</w:t>
       </w:r>
     </w:p>
     <w:p>
@@ -2405,79 +2913,82 @@
       </w:pPr>
       <w:r>
         <w:rPr>
+          <w:rStyle w:val="VerbatimChar"/>
           <w:b/>
           <w:bCs/>
         </w:rPr>
-        <w:t xml:space="preserve">Step B (</w:t>
-      </w:r>
-      <w:r>
-        <w:rPr>
-          <w:rStyle w:val="VerbatimChar"/>
+        <w:t xml:space="preserve">--scope</w:t>
+      </w:r>
+      <w:r>
+        <w:rPr>
           <w:b/>
           <w:bCs/>
         </w:rPr>
-        <w:t xml:space="preserve">RED_MODE=1</w:t>
+        <w:t xml:space="preserve"> </w:t>
       </w:r>
       <w:r>
         <w:rPr>
           <w:b/>
           <w:bCs/>
         </w:rPr>
-        <w:t xml:space="preserve">, default):</w:t>
-      </w:r>
-      <w:r>
-        <w:t xml:space="preserve"> </w:t>
-      </w:r>
-      <w:r>
-        <w:t xml:space="preserve">reproduces the BOB-068 hazard —</w:t>
-      </w:r>
-      <w:r>
-        <w:t xml:space="preserve"> </w:t>
-      </w:r>
-      <w:r>
-        <w:t xml:space="preserve">an out-of-scope file is already staged (simulating a concurrent</w:t>
-      </w:r>
-      <w:r>
-        <w:t xml:space="preserve"> </w:t>
-      </w:r>
-      <w:r>
-        <w:t xml:space="preserve">subagent) before</w:t>
-      </w:r>
-      <w:r>
-        <w:t xml:space="preserve"> </w:t>
-      </w:r>
-      <w:r>
-        <w:rPr>
-          <w:rStyle w:val="VerbatimChar"/>
-        </w:rPr>
-        <w:t xml:space="preserve">--scope</w:t>
-      </w:r>
-      <w:r>
-        <w:t xml:space="preserve"> </w:t>
-      </w:r>
-      <w:r>
-        <w:t xml:space="preserve">runs — and confirms</w:t>
-      </w:r>
-      <w:r>
-        <w:t xml:space="preserve"> </w:t>
-      </w:r>
-      <w:r>
-        <w:rPr>
-          <w:rStyle w:val="VerbatimChar"/>
-        </w:rPr>
-        <w:t xml:space="preserve">--scope</w:t>
-      </w:r>
-      <w:r>
-        <w:t xml:space="preserve"> </w:t>
-      </w:r>
-      <w:r>
-        <w:t xml:space="preserve">rejects,</w:t>
-      </w:r>
-      <w:r>
-        <w:t xml:space="preserve"> </w:t>
-      </w:r>
-      <w:r>
-        <w:t xml:space="preserve">names the file, and leaves no new commit.</w:t>
+        <w:t xml:space="preserve">with zero matching changes.</w:t>
+      </w:r>
+      <w:r>
+        <w:t xml:space="preserve"> </w:t>
+      </w:r>
+      <w:r>
+        <w:t xml:space="preserve">If the declared path has</w:t>
+      </w:r>
+      <w:r>
+        <w:t xml:space="preserve"> </w:t>
+      </w:r>
+      <w:r>
+        <w:t xml:space="preserve">no working-tree delta,</w:t>
+      </w:r>
+      <w:r>
+        <w:t xml:space="preserve"> </w:t>
+      </w:r>
+      <w:r>
+        <w:rPr>
+          <w:rStyle w:val="VerbatimChar"/>
+        </w:rPr>
+        <w:t xml:space="preserve">git diff --cached --quiet</w:t>
+      </w:r>
+      <w:r>
+        <w:t xml:space="preserve"> </w:t>
+      </w:r>
+      <w:r>
+        <w:t xml:space="preserve">is true after</w:t>
+      </w:r>
+      <w:r>
+        <w:t xml:space="preserve"> </w:t>
+      </w:r>
+      <w:r>
+        <w:rPr>
+          <w:rStyle w:val="VerbatimChar"/>
+        </w:rPr>
+        <w:t xml:space="preserve">git add</w:t>
+      </w:r>
+      <w:r>
+        <w:t xml:space="preserve">, and the script logs</w:t>
+      </w:r>
+      <w:r>
+        <w:t xml:space="preserve"> </w:t>
+      </w:r>
+      <w:r>
+        <w:t xml:space="preserve">“nothing to commit”</w:t>
+      </w:r>
+      <w:r>
+        <w:t xml:space="preserve"> </w:t>
+      </w:r>
+      <w:r>
+        <w:t xml:space="preserve">and proceeds</w:t>
+      </w:r>
+      <w:r>
+        <w:t xml:space="preserve"> </w:t>
+      </w:r>
+      <w:r>
+        <w:t xml:space="preserve">straight to the push stage (same as default mode).</w:t>
       </w:r>
     </w:p>
     <w:p>
@@ -2490,86 +3001,114 @@
       </w:pPr>
       <w:r>
         <w:rPr>
-          <w:rStyle w:val="VerbatimChar"/>
           <w:b/>
           <w:bCs/>
         </w:rPr>
-        <w:t xml:space="preserve">RED_MODE=0</w:t>
-      </w:r>
+        <w:t xml:space="preserve">Directory scope.</w:t>
+      </w:r>
+      <w:r>
+        <w:t xml:space="preserve"> </w:t>
+      </w:r>
+      <w:r>
+        <w:rPr>
+          <w:rStyle w:val="VerbatimChar"/>
+        </w:rPr>
+        <w:t xml:space="preserve">--scope some/dir</w:t>
+      </w:r>
+      <w:r>
+        <w:t xml:space="preserve"> </w:t>
+      </w:r>
+      <w:r>
+        <w:t xml:space="preserve">stages the whole subtree</w:t>
+      </w:r>
+      <w:r>
+        <w:t xml:space="preserve"> </w:t>
+      </w:r>
+      <w:r>
+        <w:t xml:space="preserve">under</w:t>
+      </w:r>
+      <w:r>
+        <w:t xml:space="preserve"> </w:t>
+      </w:r>
+      <w:r>
+        <w:rPr>
+          <w:rStyle w:val="VerbatimChar"/>
+        </w:rPr>
+        <w:t xml:space="preserve">some/dir</w:t>
+      </w:r>
+      <w:r>
+        <w:t xml:space="preserve">; the safety check’s prefix match (</w:t>
+      </w:r>
+      <w:r>
+        <w:rPr>
+          <w:rStyle w:val="VerbatimChar"/>
+        </w:rPr>
+        <w:t xml:space="preserve">some/dir/...</w:t>
+      </w:r>
+      <w:r>
+        <w:t xml:space="preserve">)</w:t>
+      </w:r>
+      <w:r>
+        <w:t xml:space="preserve"> </w:t>
+      </w:r>
+      <w:r>
+        <w:t xml:space="preserve">accepts any staged path under it.</w:t>
+      </w:r>
+    </w:p>
+    <w:p>
+      <w:pPr>
+        <w:pStyle w:val="Compact"/>
+        <w:numPr>
+          <w:ilvl w:val="0"/>
+          <w:numId w:val="1005"/>
+        </w:numPr>
+      </w:pPr>
       <w:r>
         <w:rPr>
           <w:b/>
           <w:bCs/>
         </w:rPr>
-        <w:t xml:space="preserve">:</w:t>
-      </w:r>
-      <w:r>
-        <w:t xml:space="preserve"> </w:t>
-      </w:r>
-      <w:r>
-        <w:t xml:space="preserve">Step A only, for a fast regression-guard rerun.</w:t>
-      </w:r>
-    </w:p>
-    <w:p>
-      <w:pPr>
-        <w:pStyle w:val="SourceCode"/>
-      </w:pPr>
-      <w:r>
-        <w:rPr>
-          <w:rStyle w:val="FunctionTok"/>
-        </w:rPr>
-        <w:t xml:space="preserve">bash</w:t>
-      </w:r>
-      <w:r>
-        <w:rPr>
-          <w:rStyle w:val="NormalTok"/>
-        </w:rPr>
-        <w:t xml:space="preserve"> challenges/scripts/commit_push_all_scope_challenge.sh          </w:t>
-      </w:r>
-      <w:r>
-        <w:rPr>
-          <w:rStyle w:val="CommentTok"/>
-        </w:rPr>
-        <w:t xml:space="preserve"># full RED+GREEN polarity</w:t>
-      </w:r>
-      <w:r>
-        <w:br/>
-      </w:r>
-      <w:r>
-        <w:rPr>
-          <w:rStyle w:val="VariableTok"/>
-        </w:rPr>
-        <w:t xml:space="preserve">RED_MODE</w:t>
-      </w:r>
-      <w:r>
-        <w:rPr>
-          <w:rStyle w:val="OperatorTok"/>
-        </w:rPr>
-        <w:t xml:space="preserve">=</w:t>
-      </w:r>
-      <w:r>
-        <w:rPr>
-          <w:rStyle w:val="NormalTok"/>
-        </w:rPr>
-        <w:t xml:space="preserve">0 </w:t>
-      </w:r>
-      <w:r>
-        <w:rPr>
-          <w:rStyle w:val="FunctionTok"/>
-        </w:rPr>
-        <w:t xml:space="preserve">bash</w:t>
-      </w:r>
-      <w:r>
-        <w:rPr>
-          <w:rStyle w:val="NormalTok"/>
-        </w:rPr>
-        <w:t xml:space="preserve"> challenges/scripts/commit_push_all_scope_challenge.sh  </w:t>
-      </w:r>
-      <w:r>
-        <w:rPr>
-          <w:rStyle w:val="CommentTok"/>
-        </w:rPr>
-        <w:t xml:space="preserve"># GREEN-only regression guard</w:t>
+        <w:t xml:space="preserve">Mixing scoped and unscoped semantics.</w:t>
+      </w:r>
+      <w:r>
+        <w:t xml:space="preserve"> </w:t>
+      </w:r>
+      <w:r>
+        <w:t xml:space="preserve">There is no flag to mix</w:t>
+      </w:r>
+      <w:r>
+        <w:t xml:space="preserve"> </w:t>
+      </w:r>
+      <w:r>
+        <w:t xml:space="preserve">“some declared paths + also sweep everything else”</w:t>
+      </w:r>
+      <w:r>
+        <w:t xml:space="preserve"> </w:t>
+      </w:r>
+      <w:r>
+        <w:t xml:space="preserve">— that would</w:t>
+      </w:r>
+      <w:r>
+        <w:t xml:space="preserve"> </w:t>
+      </w:r>
+      <w:r>
+        <w:t xml:space="preserve">defeat the purpose. Use two separate invocations if genuinely</w:t>
+      </w:r>
+      <w:r>
+        <w:t xml:space="preserve"> </w:t>
+      </w:r>
+      <w:r>
+        <w:t xml:space="preserve">needed.</w:t>
+      </w:r>
+    </w:p>
+    <w:bookmarkEnd w:id="21"/>
+    <w:bookmarkStart w:id="22" w:name="anti-bluff-verification"/>
+    <w:p>
+      <w:pPr>
+        <w:pStyle w:val="Heading2"/>
+      </w:pPr>
+      <w:r>
+        <w:t xml:space="preserve">Anti-bluff verification</w:t>
       </w:r>
     </w:p>
     <w:p>
@@ -2577,71 +3116,34 @@
         <w:pStyle w:val="FirstParagraph"/>
       </w:pPr>
       <w:r>
-        <w:t xml:space="preserve">A §1.1 paired mutation (stripping the rejection block from a scratch</w:t>
-      </w:r>
-      <w:r>
-        <w:t xml:space="preserve"> </w:t>
-      </w:r>
-      <w:r>
-        <w:t xml:space="preserve">copy of</w:t>
-      </w:r>
-      <w:r>
-        <w:t xml:space="preserve"> </w:t>
-      </w:r>
-      <w:r>
-        <w:rPr>
-          <w:rStyle w:val="VerbatimChar"/>
-        </w:rPr>
-        <w:t xml:space="preserve">commit-push-all.sh</w:t>
-      </w:r>
-      <w:r>
-        <w:t xml:space="preserve"> </w:t>
-      </w:r>
-      <w:r>
-        <w:t xml:space="preserve">and re-running Step B’s exact hazard</w:t>
-      </w:r>
-      <w:r>
-        <w:t xml:space="preserve"> </w:t>
-      </w:r>
-      <w:r>
-        <w:t xml:space="preserve">scenario against it) was performed during task #66’s implementation</w:t>
-      </w:r>
-      <w:r>
-        <w:t xml:space="preserve"> </w:t>
-      </w:r>
-      <w:r>
-        <w:t xml:space="preserve">and confirmed the mutated script silently commits the out-of-scope</w:t>
-      </w:r>
-      <w:r>
-        <w:t xml:space="preserve"> </w:t>
-      </w:r>
-      <w:r>
-        <w:t xml:space="preserve">file — proving the check is load-bearing. See</w:t>
-      </w:r>
-      <w:r>
-        <w:t xml:space="preserve"> </w:t>
-      </w:r>
-      <w:r>
-        <w:rPr>
-          <w:rStyle w:val="VerbatimChar"/>
-        </w:rPr>
-        <w:t xml:space="preserve">.superpowers/sdd/task-66-report.md</w:t>
-      </w:r>
-      <w:r>
-        <w:t xml:space="preserve"> </w:t>
-      </w:r>
-      <w:r>
-        <w:t xml:space="preserve">for the pasted terminal evidence.</w:t>
-      </w:r>
-    </w:p>
-    <w:bookmarkEnd w:id="21"/>
-    <w:bookmarkStart w:id="22" w:name="related-scripts"/>
-    <w:p>
-      <w:pPr>
-        <w:pStyle w:val="Heading2"/>
-      </w:pPr>
-      <w:r>
-        <w:t xml:space="preserve">Related scripts</w:t>
+        <w:rPr>
+          <w:rStyle w:val="VerbatimChar"/>
+        </w:rPr>
+        <w:t xml:space="preserve">challenges/scripts/commit_push_all_scope_challenge.sh</w:t>
+      </w:r>
+      <w:r>
+        <w:t xml:space="preserve"> </w:t>
+      </w:r>
+      <w:r>
+        <w:t xml:space="preserve">proves the</w:t>
+      </w:r>
+      <w:r>
+        <w:t xml:space="preserve"> </w:t>
+      </w:r>
+      <w:r>
+        <w:t xml:space="preserve">safety layer is real (not decorative) via §11.4.115 RED/GREEN</w:t>
+      </w:r>
+      <w:r>
+        <w:t xml:space="preserve"> </w:t>
+      </w:r>
+      <w:r>
+        <w:t xml:space="preserve">polarity, run entirely against a throwaway sandbox git repo (zero</w:t>
+      </w:r>
+      <w:r>
+        <w:t xml:space="preserve"> </w:t>
+      </w:r>
+      <w:r>
+        <w:t xml:space="preserve">remotes — never touches the real boba repo or pushes anywhere):</w:t>
       </w:r>
     </w:p>
     <w:p>
@@ -2654,21 +3156,38 @@
       </w:pPr>
       <w:r>
         <w:rPr>
-          <w:rStyle w:val="VerbatimChar"/>
-        </w:rPr>
-        <w:t xml:space="preserve">scripts/pre_build_verification.sh</w:t>
-      </w:r>
-      <w:r>
-        <w:t xml:space="preserve"> </w:t>
-      </w:r>
-      <w:r>
-        <w:t xml:space="preserve">— the long gate this entrypoint</w:t>
-      </w:r>
-      <w:r>
-        <w:t xml:space="preserve"> </w:t>
-      </w:r>
-      <w:r>
-        <w:t xml:space="preserve">runs at stage 3.</w:t>
+          <w:b/>
+          <w:bCs/>
+        </w:rPr>
+        <w:t xml:space="preserve">Step A (always runs):</w:t>
+      </w:r>
+      <w:r>
+        <w:t xml:space="preserve"> </w:t>
+      </w:r>
+      <w:r>
+        <w:t xml:space="preserve">a genuine single-scope commit succeeds</w:t>
+      </w:r>
+      <w:r>
+        <w:t xml:space="preserve"> </w:t>
+      </w:r>
+      <w:r>
+        <w:t xml:space="preserve">cleanly and lands</w:t>
+      </w:r>
+      <w:r>
+        <w:t xml:space="preserve"> </w:t>
+      </w:r>
+      <w:r>
+        <w:rPr>
+          <w:i/>
+          <w:iCs/>
+        </w:rPr>
+        <w:t xml:space="preserve">exactly</w:t>
+      </w:r>
+      <w:r>
+        <w:t xml:space="preserve"> </w:t>
+      </w:r>
+      <w:r>
+        <w:t xml:space="preserve">the declared file.</w:t>
       </w:r>
     </w:p>
     <w:p>
@@ -2681,21 +3200,43 @@
       </w:pPr>
       <w:r>
         <w:rPr>
-          <w:rStyle w:val="VerbatimChar"/>
-        </w:rPr>
-        <w:t xml:space="preserve">challenges/scripts/commit_push_all_scope_challenge.sh</w:t>
-      </w:r>
-      <w:r>
-        <w:t xml:space="preserve"> </w:t>
-      </w:r>
-      <w:r>
-        <w:t xml:space="preserve">— anti-bluff</w:t>
-      </w:r>
-      <w:r>
-        <w:t xml:space="preserve"> </w:t>
-      </w:r>
-      <w:r>
-        <w:t xml:space="preserve">proof for</w:t>
+          <w:b/>
+          <w:bCs/>
+        </w:rPr>
+        <w:t xml:space="preserve">Step B (</w:t>
+      </w:r>
+      <w:r>
+        <w:rPr>
+          <w:rStyle w:val="VerbatimChar"/>
+          <w:b/>
+          <w:bCs/>
+        </w:rPr>
+        <w:t xml:space="preserve">RED_MODE=1</w:t>
+      </w:r>
+      <w:r>
+        <w:rPr>
+          <w:b/>
+          <w:bCs/>
+        </w:rPr>
+        <w:t xml:space="preserve">, default):</w:t>
+      </w:r>
+      <w:r>
+        <w:t xml:space="preserve"> </w:t>
+      </w:r>
+      <w:r>
+        <w:t xml:space="preserve">reproduces the BOB-068 hazard —</w:t>
+      </w:r>
+      <w:r>
+        <w:t xml:space="preserve"> </w:t>
+      </w:r>
+      <w:r>
+        <w:t xml:space="preserve">an out-of-scope file is already staged (simulating a concurrent</w:t>
+      </w:r>
+      <w:r>
+        <w:t xml:space="preserve"> </w:t>
+      </w:r>
+      <w:r>
+        <w:t xml:space="preserve">subagent) before</w:t>
       </w:r>
       <w:r>
         <w:t xml:space="preserve"> </w:t>
@@ -2707,7 +3248,31 @@
         <w:t xml:space="preserve">--scope</w:t>
       </w:r>
       <w:r>
-        <w:t xml:space="preserve">.</w:t>
+        <w:t xml:space="preserve"> </w:t>
+      </w:r>
+      <w:r>
+        <w:t xml:space="preserve">runs — and confirms</w:t>
+      </w:r>
+      <w:r>
+        <w:t xml:space="preserve"> </w:t>
+      </w:r>
+      <w:r>
+        <w:rPr>
+          <w:rStyle w:val="VerbatimChar"/>
+        </w:rPr>
+        <w:t xml:space="preserve">--scope</w:t>
+      </w:r>
+      <w:r>
+        <w:t xml:space="preserve"> </w:t>
+      </w:r>
+      <w:r>
+        <w:t xml:space="preserve">rejects,</w:t>
+      </w:r>
+      <w:r>
+        <w:t xml:space="preserve"> </w:t>
+      </w:r>
+      <w:r>
+        <w:t xml:space="preserve">names the file, and leaves no new commit.</w:t>
       </w:r>
     </w:p>
     <w:p>
@@ -2721,6 +3286,430 @@
       <w:r>
         <w:rPr>
           <w:rStyle w:val="VerbatimChar"/>
+          <w:b/>
+          <w:bCs/>
+        </w:rPr>
+        <w:t xml:space="preserve">RED_MODE=0</w:t>
+      </w:r>
+      <w:r>
+        <w:rPr>
+          <w:b/>
+          <w:bCs/>
+        </w:rPr>
+        <w:t xml:space="preserve">:</w:t>
+      </w:r>
+      <w:r>
+        <w:t xml:space="preserve"> </w:t>
+      </w:r>
+      <w:r>
+        <w:t xml:space="preserve">Step A only, for a fast regression-guard rerun.</w:t>
+      </w:r>
+    </w:p>
+    <w:p>
+      <w:pPr>
+        <w:pStyle w:val="SourceCode"/>
+      </w:pPr>
+      <w:r>
+        <w:rPr>
+          <w:rStyle w:val="FunctionTok"/>
+        </w:rPr>
+        <w:t xml:space="preserve">bash</w:t>
+      </w:r>
+      <w:r>
+        <w:rPr>
+          <w:rStyle w:val="NormalTok"/>
+        </w:rPr>
+        <w:t xml:space="preserve"> challenges/scripts/commit_push_all_scope_challenge.sh          </w:t>
+      </w:r>
+      <w:r>
+        <w:rPr>
+          <w:rStyle w:val="CommentTok"/>
+        </w:rPr>
+        <w:t xml:space="preserve"># full RED+GREEN polarity</w:t>
+      </w:r>
+      <w:r>
+        <w:br/>
+      </w:r>
+      <w:r>
+        <w:rPr>
+          <w:rStyle w:val="VariableTok"/>
+        </w:rPr>
+        <w:t xml:space="preserve">RED_MODE</w:t>
+      </w:r>
+      <w:r>
+        <w:rPr>
+          <w:rStyle w:val="OperatorTok"/>
+        </w:rPr>
+        <w:t xml:space="preserve">=</w:t>
+      </w:r>
+      <w:r>
+        <w:rPr>
+          <w:rStyle w:val="NormalTok"/>
+        </w:rPr>
+        <w:t xml:space="preserve">0 </w:t>
+      </w:r>
+      <w:r>
+        <w:rPr>
+          <w:rStyle w:val="FunctionTok"/>
+        </w:rPr>
+        <w:t xml:space="preserve">bash</w:t>
+      </w:r>
+      <w:r>
+        <w:rPr>
+          <w:rStyle w:val="NormalTok"/>
+        </w:rPr>
+        <w:t xml:space="preserve"> challenges/scripts/commit_push_all_scope_challenge.sh  </w:t>
+      </w:r>
+      <w:r>
+        <w:rPr>
+          <w:rStyle w:val="CommentTok"/>
+        </w:rPr>
+        <w:t xml:space="preserve"># GREEN-only regression guard</w:t>
+      </w:r>
+    </w:p>
+    <w:p>
+      <w:pPr>
+        <w:pStyle w:val="FirstParagraph"/>
+      </w:pPr>
+      <w:r>
+        <w:t xml:space="preserve">A §1.1 paired mutation (stripping the rejection block from a scratch</w:t>
+      </w:r>
+      <w:r>
+        <w:t xml:space="preserve"> </w:t>
+      </w:r>
+      <w:r>
+        <w:t xml:space="preserve">copy of</w:t>
+      </w:r>
+      <w:r>
+        <w:t xml:space="preserve"> </w:t>
+      </w:r>
+      <w:r>
+        <w:rPr>
+          <w:rStyle w:val="VerbatimChar"/>
+        </w:rPr>
+        <w:t xml:space="preserve">commit-push-all.sh</w:t>
+      </w:r>
+      <w:r>
+        <w:t xml:space="preserve"> </w:t>
+      </w:r>
+      <w:r>
+        <w:t xml:space="preserve">and re-running Step B’s exact hazard</w:t>
+      </w:r>
+      <w:r>
+        <w:t xml:space="preserve"> </w:t>
+      </w:r>
+      <w:r>
+        <w:t xml:space="preserve">scenario against it) was performed during task #66’s implementation</w:t>
+      </w:r>
+      <w:r>
+        <w:t xml:space="preserve"> </w:t>
+      </w:r>
+      <w:r>
+        <w:t xml:space="preserve">and confirmed the mutated script silently commits the out-of-scope</w:t>
+      </w:r>
+      <w:r>
+        <w:t xml:space="preserve"> </w:t>
+      </w:r>
+      <w:r>
+        <w:t xml:space="preserve">file — proving the check is load-bearing. See</w:t>
+      </w:r>
+      <w:r>
+        <w:t xml:space="preserve"> </w:t>
+      </w:r>
+      <w:r>
+        <w:rPr>
+          <w:rStyle w:val="VerbatimChar"/>
+        </w:rPr>
+        <w:t xml:space="preserve">.superpowers/sdd/task-66-report.md</w:t>
+      </w:r>
+      <w:r>
+        <w:t xml:space="preserve"> </w:t>
+      </w:r>
+      <w:r>
+        <w:t xml:space="preserve">for the pasted terminal evidence.</w:t>
+      </w:r>
+    </w:p>
+    <w:p>
+      <w:pPr>
+        <w:pStyle w:val="BodyText"/>
+      </w:pPr>
+      <w:r>
+        <w:rPr>
+          <w:rStyle w:val="VerbatimChar"/>
+        </w:rPr>
+        <w:t xml:space="preserve">tests/unit/test_commit_push_all_args.sh</w:t>
+      </w:r>
+      <w:r>
+        <w:t xml:space="preserve"> </w:t>
+      </w:r>
+      <w:r>
+        <w:t xml:space="preserve">(BOB-246) covers argument</w:t>
+      </w:r>
+      <w:r>
+        <w:t xml:space="preserve"> </w:t>
+      </w:r>
+      <w:r>
+        <w:t xml:space="preserve">order and message fidelity in throwaway sandboxes whose only remote is a</w:t>
+      </w:r>
+      <w:r>
+        <w:t xml:space="preserve"> </w:t>
+      </w:r>
+      <w:r>
+        <w:t xml:space="preserve">local bare repository:</w:t>
+      </w:r>
+      <w:r>
+        <w:t xml:space="preserve"> </w:t>
+      </w:r>
+      <w:r>
+        <w:rPr>
+          <w:rStyle w:val="VerbatimChar"/>
+        </w:rPr>
+        <w:t xml:space="preserve">--scope</w:t>
+      </w:r>
+      <w:r>
+        <w:t xml:space="preserve"> </w:t>
+      </w:r>
+      <w:r>
+        <w:t xml:space="preserve">after the message and on both sides of</w:t>
+      </w:r>
+      <w:r>
+        <w:t xml:space="preserve"> </w:t>
+      </w:r>
+      <w:r>
+        <w:t xml:space="preserve">it, extra positionals, a</w:t>
+      </w:r>
+      <w:r>
+        <w:t xml:space="preserve"> </w:t>
+      </w:r>
+      <w:r>
+        <w:rPr>
+          <w:rStyle w:val="VerbatimChar"/>
+        </w:rPr>
+        <w:t xml:space="preserve">--scope</w:t>
+      </w:r>
+      <w:r>
+        <w:t xml:space="preserve"> </w:t>
+      </w:r>
+      <w:r>
+        <w:t xml:space="preserve">token after</w:t>
+      </w:r>
+      <w:r>
+        <w:t xml:space="preserve"> </w:t>
+      </w:r>
+      <w:r>
+        <w:rPr>
+          <w:rStyle w:val="VerbatimChar"/>
+        </w:rPr>
+        <w:t xml:space="preserve">--</w:t>
+      </w:r>
+      <w:r>
+        <w:t xml:space="preserve">, byte-exact messages</w:t>
+      </w:r>
+      <w:r>
+        <w:t xml:space="preserve"> </w:t>
+      </w:r>
+      <w:r>
+        <w:t xml:space="preserve">with and without the skip tag,</w:t>
+      </w:r>
+      <w:r>
+        <w:t xml:space="preserve"> </w:t>
+      </w:r>
+      <w:r>
+        <w:rPr>
+          <w:rStyle w:val="VerbatimChar"/>
+        </w:rPr>
+        <w:t xml:space="preserve">--message-file</w:t>
+      </w:r>
+      <w:r>
+        <w:t xml:space="preserve"> </w:t>
+      </w:r>
+      <w:r>
+        <w:t xml:space="preserve">from a path and from</w:t>
+      </w:r>
+      <w:r>
+        <w:t xml:space="preserve"> </w:t>
+      </w:r>
+      <w:r>
+        <w:t xml:space="preserve">stdin, and controls for the flags-first form, the unscoped default and</w:t>
+      </w:r>
+      <w:r>
+        <w:t xml:space="preserve"> </w:t>
+      </w:r>
+      <w:r>
+        <w:t xml:space="preserve">the push. Run it against another copy with</w:t>
+      </w:r>
+      <w:r>
+        <w:t xml:space="preserve"> </w:t>
+      </w:r>
+      <w:r>
+        <w:rPr>
+          <w:rStyle w:val="VerbatimChar"/>
+        </w:rPr>
+        <w:t xml:space="preserve">SUT=/path/to/copy bash tests/unit/test_commit_push_all_args.sh</w:t>
+      </w:r>
+      <w:r>
+        <w:t xml:space="preserve">; against</w:t>
+      </w:r>
+      <w:r>
+        <w:t xml:space="preserve"> </w:t>
+      </w:r>
+      <w:r>
+        <w:t xml:space="preserve">the pre-fix script it fails 9 of 13 checks.</w:t>
+      </w:r>
+    </w:p>
+    <w:bookmarkEnd w:id="22"/>
+    <w:bookmarkStart w:id="23" w:name="related-scripts"/>
+    <w:p>
+      <w:pPr>
+        <w:pStyle w:val="Heading2"/>
+      </w:pPr>
+      <w:r>
+        <w:t xml:space="preserve">Related scripts</w:t>
+      </w:r>
+    </w:p>
+    <w:p>
+      <w:pPr>
+        <w:pStyle w:val="Compact"/>
+        <w:numPr>
+          <w:ilvl w:val="0"/>
+          <w:numId w:val="1007"/>
+        </w:numPr>
+      </w:pPr>
+      <w:r>
+        <w:rPr>
+          <w:rStyle w:val="VerbatimChar"/>
+        </w:rPr>
+        <w:t xml:space="preserve">scripts/pre_build_verification.sh</w:t>
+      </w:r>
+      <w:r>
+        <w:t xml:space="preserve"> </w:t>
+      </w:r>
+      <w:r>
+        <w:t xml:space="preserve">— the long gate this entrypoint</w:t>
+      </w:r>
+      <w:r>
+        <w:t xml:space="preserve"> </w:t>
+      </w:r>
+      <w:r>
+        <w:t xml:space="preserve">runs at stage 3.</w:t>
+      </w:r>
+    </w:p>
+    <w:p>
+      <w:pPr>
+        <w:pStyle w:val="Compact"/>
+        <w:numPr>
+          <w:ilvl w:val="0"/>
+          <w:numId w:val="1007"/>
+        </w:numPr>
+      </w:pPr>
+      <w:r>
+        <w:rPr>
+          <w:rStyle w:val="VerbatimChar"/>
+        </w:rPr>
+        <w:t xml:space="preserve">challenges/scripts/commit_push_all_scope_challenge.sh</w:t>
+      </w:r>
+      <w:r>
+        <w:t xml:space="preserve"> </w:t>
+      </w:r>
+      <w:r>
+        <w:t xml:space="preserve">— anti-bluff</w:t>
+      </w:r>
+      <w:r>
+        <w:t xml:space="preserve"> </w:t>
+      </w:r>
+      <w:r>
+        <w:t xml:space="preserve">proof for</w:t>
+      </w:r>
+      <w:r>
+        <w:t xml:space="preserve"> </w:t>
+      </w:r>
+      <w:r>
+        <w:rPr>
+          <w:rStyle w:val="VerbatimChar"/>
+        </w:rPr>
+        <w:t xml:space="preserve">--scope</w:t>
+      </w:r>
+      <w:r>
+        <w:t xml:space="preserve">.</w:t>
+      </w:r>
+    </w:p>
+    <w:p>
+      <w:pPr>
+        <w:pStyle w:val="Compact"/>
+        <w:numPr>
+          <w:ilvl w:val="0"/>
+          <w:numId w:val="1007"/>
+        </w:numPr>
+      </w:pPr>
+      <w:r>
+        <w:rPr>
+          <w:rStyle w:val="VerbatimChar"/>
+        </w:rPr>
+        <w:t xml:space="preserve">tests/unit/test_commit_push_all_args.sh</w:t>
+      </w:r>
+      <w:r>
+        <w:t xml:space="preserve"> </w:t>
+      </w:r>
+      <w:r>
+        <w:t xml:space="preserve">— argument order and message</w:t>
+      </w:r>
+      <w:r>
+        <w:t xml:space="preserve"> </w:t>
+      </w:r>
+      <w:r>
+        <w:t xml:space="preserve">fidelity (BOB-246).</w:t>
+      </w:r>
+    </w:p>
+    <w:p>
+      <w:pPr>
+        <w:pStyle w:val="Compact"/>
+        <w:numPr>
+          <w:ilvl w:val="0"/>
+          <w:numId w:val="1007"/>
+        </w:numPr>
+      </w:pPr>
+      <w:r>
+        <w:rPr>
+          <w:rStyle w:val="VerbatimChar"/>
+        </w:rPr>
+        <w:t xml:space="preserve">scripts/git_hooks/pre-push</w:t>
+      </w:r>
+      <w:r>
+        <w:t xml:space="preserve"> </w:t>
+      </w:r>
+      <w:r>
+        <w:t xml:space="preserve">— the installed pre-push hook that stage 6</w:t>
+      </w:r>
+      <w:r>
+        <w:t xml:space="preserve"> </w:t>
+      </w:r>
+      <w:r>
+        <w:t xml:space="preserve">pushes run through (see</w:t>
+      </w:r>
+      <w:r>
+        <w:t xml:space="preserve"> </w:t>
+      </w:r>
+      <w:r>
+        <w:rPr>
+          <w:rStyle w:val="VerbatimChar"/>
+        </w:rPr>
+        <w:t xml:space="preserve">docs/scripts/install_git_hooks.md</w:t>
+      </w:r>
+      <w:r>
+        <w:t xml:space="preserve">).</w:t>
+      </w:r>
+    </w:p>
+    <w:p>
+      <w:pPr>
+        <w:pStyle w:val="Compact"/>
+        <w:numPr>
+          <w:ilvl w:val="0"/>
+          <w:numId w:val="1007"/>
+        </w:numPr>
+      </w:pPr>
+      <w:r>
+        <w:rPr>
+          <w:rStyle w:val="VerbatimChar"/>
         </w:rPr>
         <w:t xml:space="preserve">docs/proposals/</w:t>
       </w:r>
@@ -2758,8 +3747,8 @@
         <w:t xml:space="preserve">substitute for.</w:t>
       </w:r>
     </w:p>
-    <w:bookmarkEnd w:id="22"/>
     <w:bookmarkEnd w:id="23"/>
+    <w:bookmarkEnd w:id="24"/>
     <w:sectPr>
       <w:footnotePr>
         <w:numRestart w:val="eachSect"/>
@@ -3068,6 +4057,9 @@
     <w:abstractNumId w:val="991"/>
   </w:num>
   <w:num w:numId="1003">
+    <w:abstractNumId w:val="991"/>
+  </w:num>
+  <w:num w:numId="1004">
     <w:abstractNumId w:val="99411"/>
     <w:lvlOverride w:ilvl="0">
       <w:startOverride w:val="1"/>
@@ -3097,13 +4089,13 @@
       <w:startOverride w:val="1"/>
     </w:lvlOverride>
   </w:num>
-  <w:num w:numId="1004">
-    <w:abstractNumId w:val="991"/>
-  </w:num>
   <w:num w:numId="1005">
     <w:abstractNumId w:val="991"/>
   </w:num>
   <w:num w:numId="1006">
+    <w:abstractNumId w:val="991"/>
+  </w:num>
+  <w:num w:numId="1007">
     <w:abstractNumId w:val="991"/>
   </w:num>
 </w:numbering>

</xml_diff>